<commit_message>
feat(N066): verify live AI responses, pass 100% unit tests, and embed screenshots in report docx
</commit_message>
<xml_diff>
--- a/N066_MAD_ASSIGNMENT01_GEMINICHATBOT.docx
+++ b/N066_MAD_ASSIGNMENT01_GEMINICHATBOT.docx
@@ -9,57 +9,44 @@
       </w:pPr>
       <w:r>
         <w:rPr>
-          <w:rFonts w:ascii="Calibri" w:hAnsi="Calibri"/>
           <w:b/>
-          <w:color w:val="B71C1C"/>
-          <w:sz w:val="34"/>
+          <w:color w:val="182B49"/>
+          <w:sz w:val="32"/>
         </w:rPr>
         <w:t>SVKM's NMIMS University</w:t>
         <w:br/>
       </w:r>
       <w:r>
         <w:rPr>
-          <w:rFonts w:ascii="Calibri" w:hAnsi="Calibri"/>
-          <w:color w:val="424242"/>
-          <w:sz w:val="24"/>
+          <w:color w:val="6C757D"/>
+          <w:sz w:val="22"/>
         </w:rPr>
         <w:t>School of Technology Management &amp; Engineering, Mumbai</w:t>
         <w:br/>
         <w:t>Department of Computer Engineering &amp; Information Technology</w:t>
         <w:br/>
       </w:r>
+      <w:r>
+        <w:rPr>
+          <w:b/>
+          <w:color w:val="2980B9"/>
+          <w:sz w:val="24"/>
+        </w:rPr>
+        <w:t>LAB ASSIGNMENT - 1: MOBILE APPLICATION DEVELOPMENT</w:t>
+        <w:br/>
+        <w:t>(Subject Code: 702AI0E002 | Academic Year: 2024–2026)</w:t>
+      </w:r>
     </w:p>
     <w:p>
       <w:pPr>
-        <w:spacing w:before="120" w:after="240"/>
-        <w:jc w:val="center"/>
+        <w:spacing w:after="80"/>
       </w:pPr>
-      <w:r>
-        <w:rPr>
-          <w:rFonts w:ascii="Calibri" w:hAnsi="Calibri"/>
-          <w:b/>
-          <w:color w:val="1565C0"/>
-          <w:sz w:val="36"/>
-        </w:rPr>
-        <w:t>LAB ASSIGNMENT - 1 REPORT</w:t>
-        <w:br/>
-      </w:r>
-      <w:r>
-        <w:rPr>
-          <w:rFonts w:ascii="Calibri" w:hAnsi="Calibri"/>
-          <w:b/>
-          <w:color w:val="616161"/>
-          <w:sz w:val="22"/>
-        </w:rPr>
-        <w:t>Course: Mobile Application Development (Subject Code: 702AI0E002)</w:t>
-        <w:br/>
-        <w:t>Academic Year: 2024–2025 / 2025–2026</w:t>
-      </w:r>
     </w:p>
     <w:tbl>
       <w:tblPr>
         <w:tblW w:type="auto" w:w="0"/>
         <w:jc w:val="center"/>
+        <w:tblLayout w:type="fixed"/>
         <w:tblLook w:firstColumn="1" w:firstRow="1" w:lastColumn="0" w:lastRow="0" w:noHBand="0" w:noVBand="1" w:val="04A0"/>
       </w:tblPr>
       <w:tblGrid>
@@ -70,23 +57,22 @@
         <w:tc>
           <w:tcPr>
             <w:tcW w:type="dxa" w:w="3168"/>
-            <w:shd w:fill="EBF3FA"/>
+            <w:shd w:fill="F1F5F9"/>
             <w:tcMar>
-              <w:top w:w="70" w:type="dxa"/>
-              <w:bottom w:w="70" w:type="dxa"/>
-              <w:left w:w="100" w:type="dxa"/>
-              <w:right w:w="100" w:type="dxa"/>
+              <w:top w:w="140" w:type="dxa"/>
+              <w:bottom w:w="140" w:type="dxa"/>
+              <w:left w:w="180" w:type="dxa"/>
+              <w:right w:w="180" w:type="dxa"/>
             </w:tcMar>
           </w:tcPr>
           <w:p>
             <w:pPr>
-              <w:spacing w:before="0" w:after="0"/>
+              <w:spacing w:after="40"/>
             </w:pPr>
             <w:r>
               <w:rPr>
-                <w:rFonts w:ascii="Calibri" w:hAnsi="Calibri"/>
                 <w:b/>
-                <w:color w:val="212121"/>
+                <w:color w:val="182B49"/>
                 <w:sz w:val="20"/>
               </w:rPr>
               <w:t>Student Name</w:t>
@@ -95,22 +81,21 @@
         </w:tc>
         <w:tc>
           <w:tcPr>
-            <w:tcW w:type="dxa" w:w="6480"/>
-            <w:shd w:fill="FAFAFA"/>
+            <w:tcW w:type="dxa" w:w="6624"/>
+            <w:shd w:fill="F8FAFC"/>
             <w:tcMar>
-              <w:top w:w="70" w:type="dxa"/>
-              <w:bottom w:w="70" w:type="dxa"/>
-              <w:left w:w="100" w:type="dxa"/>
-              <w:right w:w="100" w:type="dxa"/>
+              <w:top w:w="140" w:type="dxa"/>
+              <w:bottom w:w="140" w:type="dxa"/>
+              <w:left w:w="180" w:type="dxa"/>
+              <w:right w:w="180" w:type="dxa"/>
             </w:tcMar>
           </w:tcPr>
           <w:p>
             <w:pPr>
-              <w:spacing w:before="0" w:after="0"/>
+              <w:spacing w:after="40"/>
             </w:pPr>
             <w:r>
               <w:rPr>
-                <w:rFonts w:ascii="Calibri" w:hAnsi="Calibri"/>
                 <w:sz w:val="20"/>
               </w:rPr>
               <w:t>Devraj Murari</w:t>
@@ -122,23 +107,22 @@
         <w:tc>
           <w:tcPr>
             <w:tcW w:type="dxa" w:w="3168"/>
-            <w:shd w:fill="F4F8FC"/>
+            <w:shd w:fill="FFFFFF"/>
             <w:tcMar>
-              <w:top w:w="70" w:type="dxa"/>
-              <w:bottom w:w="70" w:type="dxa"/>
-              <w:left w:w="100" w:type="dxa"/>
-              <w:right w:w="100" w:type="dxa"/>
+              <w:top w:w="140" w:type="dxa"/>
+              <w:bottom w:w="140" w:type="dxa"/>
+              <w:left w:w="180" w:type="dxa"/>
+              <w:right w:w="180" w:type="dxa"/>
             </w:tcMar>
           </w:tcPr>
           <w:p>
             <w:pPr>
-              <w:spacing w:before="0" w:after="0"/>
+              <w:spacing w:after="40"/>
             </w:pPr>
             <w:r>
               <w:rPr>
-                <w:rFonts w:ascii="Calibri" w:hAnsi="Calibri"/>
                 <w:b/>
-                <w:color w:val="212121"/>
+                <w:color w:val="182B49"/>
                 <w:sz w:val="20"/>
               </w:rPr>
               <w:t>Roll Number</w:t>
@@ -147,24 +131,23 @@
         </w:tc>
         <w:tc>
           <w:tcPr>
-            <w:tcW w:type="dxa" w:w="6480"/>
+            <w:tcW w:type="dxa" w:w="6624"/>
             <w:shd w:fill="FFFFFF"/>
             <w:tcMar>
-              <w:top w:w="70" w:type="dxa"/>
-              <w:bottom w:w="70" w:type="dxa"/>
-              <w:left w:w="100" w:type="dxa"/>
-              <w:right w:w="100" w:type="dxa"/>
+              <w:top w:w="140" w:type="dxa"/>
+              <w:bottom w:w="140" w:type="dxa"/>
+              <w:left w:w="180" w:type="dxa"/>
+              <w:right w:w="180" w:type="dxa"/>
             </w:tcMar>
           </w:tcPr>
           <w:p>
             <w:pPr>
-              <w:spacing w:before="0" w:after="0"/>
+              <w:spacing w:after="40"/>
             </w:pPr>
             <w:r>
               <w:rPr>
-                <w:rFonts w:ascii="Calibri" w:hAnsi="Calibri"/>
                 <w:b/>
-                <w:color w:val="B71C1C"/>
+                <w:color w:val="2980B9"/>
                 <w:sz w:val="20"/>
               </w:rPr>
               <w:t>N066</w:t>
@@ -176,23 +159,22 @@
         <w:tc>
           <w:tcPr>
             <w:tcW w:type="dxa" w:w="3168"/>
-            <w:shd w:fill="EBF3FA"/>
+            <w:shd w:fill="F1F5F9"/>
             <w:tcMar>
-              <w:top w:w="70" w:type="dxa"/>
-              <w:bottom w:w="70" w:type="dxa"/>
-              <w:left w:w="100" w:type="dxa"/>
-              <w:right w:w="100" w:type="dxa"/>
+              <w:top w:w="140" w:type="dxa"/>
+              <w:bottom w:w="140" w:type="dxa"/>
+              <w:left w:w="180" w:type="dxa"/>
+              <w:right w:w="180" w:type="dxa"/>
             </w:tcMar>
           </w:tcPr>
           <w:p>
             <w:pPr>
-              <w:spacing w:before="0" w:after="0"/>
+              <w:spacing w:after="40"/>
             </w:pPr>
             <w:r>
               <w:rPr>
-                <w:rFonts w:ascii="Calibri" w:hAnsi="Calibri"/>
                 <w:b/>
-                <w:color w:val="212121"/>
+                <w:color w:val="182B49"/>
                 <w:sz w:val="20"/>
               </w:rPr>
               <w:t>Course Name</w:t>
@@ -201,22 +183,21 @@
         </w:tc>
         <w:tc>
           <w:tcPr>
-            <w:tcW w:type="dxa" w:w="6480"/>
-            <w:shd w:fill="FAFAFA"/>
+            <w:tcW w:type="dxa" w:w="6624"/>
+            <w:shd w:fill="F8FAFC"/>
             <w:tcMar>
-              <w:top w:w="70" w:type="dxa"/>
-              <w:bottom w:w="70" w:type="dxa"/>
-              <w:left w:w="100" w:type="dxa"/>
-              <w:right w:w="100" w:type="dxa"/>
+              <w:top w:w="140" w:type="dxa"/>
+              <w:bottom w:w="140" w:type="dxa"/>
+              <w:left w:w="180" w:type="dxa"/>
+              <w:right w:w="180" w:type="dxa"/>
             </w:tcMar>
           </w:tcPr>
           <w:p>
             <w:pPr>
-              <w:spacing w:before="0" w:after="0"/>
+              <w:spacing w:after="40"/>
             </w:pPr>
             <w:r>
               <w:rPr>
-                <w:rFonts w:ascii="Calibri" w:hAnsi="Calibri"/>
                 <w:sz w:val="20"/>
               </w:rPr>
               <w:t>Mobile Application Development (702AI0E002)</w:t>
@@ -228,47 +209,45 @@
         <w:tc>
           <w:tcPr>
             <w:tcW w:type="dxa" w:w="3168"/>
-            <w:shd w:fill="F4F8FC"/>
+            <w:shd w:fill="FFFFFF"/>
             <w:tcMar>
-              <w:top w:w="70" w:type="dxa"/>
-              <w:bottom w:w="70" w:type="dxa"/>
-              <w:left w:w="100" w:type="dxa"/>
-              <w:right w:w="100" w:type="dxa"/>
+              <w:top w:w="140" w:type="dxa"/>
+              <w:bottom w:w="140" w:type="dxa"/>
+              <w:left w:w="180" w:type="dxa"/>
+              <w:right w:w="180" w:type="dxa"/>
             </w:tcMar>
           </w:tcPr>
           <w:p>
             <w:pPr>
-              <w:spacing w:before="0" w:after="0"/>
+              <w:spacing w:after="40"/>
             </w:pPr>
             <w:r>
               <w:rPr>
-                <w:rFonts w:ascii="Calibri" w:hAnsi="Calibri"/>
                 <w:b/>
-                <w:color w:val="212121"/>
+                <w:color w:val="182B49"/>
                 <w:sz w:val="20"/>
               </w:rPr>
-              <w:t>Project Title</w:t>
+              <w:t>Assignment Title</w:t>
             </w:r>
           </w:p>
         </w:tc>
         <w:tc>
           <w:tcPr>
-            <w:tcW w:type="dxa" w:w="6480"/>
+            <w:tcW w:type="dxa" w:w="6624"/>
             <w:shd w:fill="FFFFFF"/>
             <w:tcMar>
-              <w:top w:w="70" w:type="dxa"/>
-              <w:bottom w:w="70" w:type="dxa"/>
-              <w:left w:w="100" w:type="dxa"/>
-              <w:right w:w="100" w:type="dxa"/>
+              <w:top w:w="140" w:type="dxa"/>
+              <w:bottom w:w="140" w:type="dxa"/>
+              <w:left w:w="180" w:type="dxa"/>
+              <w:right w:w="180" w:type="dxa"/>
             </w:tcMar>
           </w:tcPr>
           <w:p>
             <w:pPr>
-              <w:spacing w:before="0" w:after="0"/>
+              <w:spacing w:after="40"/>
             </w:pPr>
             <w:r>
               <w:rPr>
-                <w:rFonts w:ascii="Calibri" w:hAnsi="Calibri"/>
                 <w:sz w:val="20"/>
               </w:rPr>
               <w:t>Gemini AI Assistant Chatbot (Jetpack Compose &amp; Material 3)</w:t>
@@ -280,23 +259,72 @@
         <w:tc>
           <w:tcPr>
             <w:tcW w:type="dxa" w:w="3168"/>
-            <w:shd w:fill="EBF3FA"/>
+            <w:shd w:fill="F1F5F9"/>
             <w:tcMar>
-              <w:top w:w="70" w:type="dxa"/>
-              <w:bottom w:w="70" w:type="dxa"/>
-              <w:left w:w="100" w:type="dxa"/>
-              <w:right w:w="100" w:type="dxa"/>
+              <w:top w:w="140" w:type="dxa"/>
+              <w:bottom w:w="140" w:type="dxa"/>
+              <w:left w:w="180" w:type="dxa"/>
+              <w:right w:w="180" w:type="dxa"/>
             </w:tcMar>
           </w:tcPr>
           <w:p>
             <w:pPr>
-              <w:spacing w:before="0" w:after="0"/>
+              <w:spacing w:after="40"/>
             </w:pPr>
             <w:r>
               <w:rPr>
-                <w:rFonts w:ascii="Calibri" w:hAnsi="Calibri"/>
                 <w:b/>
-                <w:color w:val="212121"/>
+                <w:color w:val="182B49"/>
+                <w:sz w:val="20"/>
+              </w:rPr>
+              <w:t>Package Identifier</w:t>
+            </w:r>
+          </w:p>
+        </w:tc>
+        <w:tc>
+          <w:tcPr>
+            <w:tcW w:type="dxa" w:w="6624"/>
+            <w:shd w:fill="F8FAFC"/>
+            <w:tcMar>
+              <w:top w:w="140" w:type="dxa"/>
+              <w:bottom w:w="140" w:type="dxa"/>
+              <w:left w:w="180" w:type="dxa"/>
+              <w:right w:w="180" w:type="dxa"/>
+            </w:tcMar>
+          </w:tcPr>
+          <w:p>
+            <w:pPr>
+              <w:spacing w:after="40"/>
+            </w:pPr>
+            <w:r>
+              <w:rPr>
+                <w:sz w:val="20"/>
+              </w:rPr>
+              <w:t>com.devraj.geminiassistant</w:t>
+            </w:r>
+          </w:p>
+        </w:tc>
+      </w:tr>
+      <w:tr>
+        <w:tc>
+          <w:tcPr>
+            <w:tcW w:type="dxa" w:w="3168"/>
+            <w:shd w:fill="FFFFFF"/>
+            <w:tcMar>
+              <w:top w:w="140" w:type="dxa"/>
+              <w:bottom w:w="140" w:type="dxa"/>
+              <w:left w:w="180" w:type="dxa"/>
+              <w:right w:w="180" w:type="dxa"/>
+            </w:tcMar>
+          </w:tcPr>
+          <w:p>
+            <w:pPr>
+              <w:spacing w:after="40"/>
+            </w:pPr>
+            <w:r>
+              <w:rPr>
+                <w:b/>
+                <w:color w:val="182B49"/>
                 <w:sz w:val="20"/>
               </w:rPr>
               <w:t>Submission Branch</w:t>
@@ -305,22 +333,21 @@
         </w:tc>
         <w:tc>
           <w:tcPr>
-            <w:tcW w:type="dxa" w:w="6480"/>
-            <w:shd w:fill="FAFAFA"/>
+            <w:tcW w:type="dxa" w:w="6624"/>
+            <w:shd w:fill="FFFFFF"/>
             <w:tcMar>
-              <w:top w:w="70" w:type="dxa"/>
-              <w:bottom w:w="70" w:type="dxa"/>
-              <w:left w:w="100" w:type="dxa"/>
-              <w:right w:w="100" w:type="dxa"/>
+              <w:top w:w="140" w:type="dxa"/>
+              <w:bottom w:w="140" w:type="dxa"/>
+              <w:left w:w="180" w:type="dxa"/>
+              <w:right w:w="180" w:type="dxa"/>
             </w:tcMar>
           </w:tcPr>
           <w:p>
             <w:pPr>
-              <w:spacing w:before="0" w:after="0"/>
+              <w:spacing w:after="40"/>
             </w:pPr>
             <w:r>
               <w:rPr>
-                <w:rFonts w:ascii="Calibri" w:hAnsi="Calibri"/>
                 <w:sz w:val="20"/>
               </w:rPr>
               <w:t>N066_assignment_1</w:t>
@@ -332,75 +359,22 @@
         <w:tc>
           <w:tcPr>
             <w:tcW w:type="dxa" w:w="3168"/>
-            <w:shd w:fill="F4F8FC"/>
+            <w:shd w:fill="F1F5F9"/>
             <w:tcMar>
-              <w:top w:w="70" w:type="dxa"/>
-              <w:bottom w:w="70" w:type="dxa"/>
-              <w:left w:w="100" w:type="dxa"/>
-              <w:right w:w="100" w:type="dxa"/>
+              <w:top w:w="140" w:type="dxa"/>
+              <w:bottom w:w="140" w:type="dxa"/>
+              <w:left w:w="180" w:type="dxa"/>
+              <w:right w:w="180" w:type="dxa"/>
             </w:tcMar>
           </w:tcPr>
           <w:p>
             <w:pPr>
-              <w:spacing w:before="0" w:after="0"/>
+              <w:spacing w:after="40"/>
             </w:pPr>
             <w:r>
               <w:rPr>
-                <w:rFonts w:ascii="Calibri" w:hAnsi="Calibri"/>
                 <w:b/>
-                <w:color w:val="212121"/>
-                <w:sz w:val="20"/>
-              </w:rPr>
-              <w:t>GitHub Profile</w:t>
-            </w:r>
-          </w:p>
-        </w:tc>
-        <w:tc>
-          <w:tcPr>
-            <w:tcW w:type="dxa" w:w="6480"/>
-            <w:shd w:fill="FFFFFF"/>
-            <w:tcMar>
-              <w:top w:w="70" w:type="dxa"/>
-              <w:bottom w:w="70" w:type="dxa"/>
-              <w:left w:w="100" w:type="dxa"/>
-              <w:right w:w="100" w:type="dxa"/>
-            </w:tcMar>
-          </w:tcPr>
-          <w:p>
-            <w:pPr>
-              <w:spacing w:before="0" w:after="0"/>
-            </w:pPr>
-            <w:r>
-              <w:rPr>
-                <w:rFonts w:ascii="Calibri" w:hAnsi="Calibri"/>
-                <w:sz w:val="20"/>
-              </w:rPr>
-              <w:t>https://github.com/dev-raj-murari</w:t>
-            </w:r>
-          </w:p>
-        </w:tc>
-      </w:tr>
-      <w:tr>
-        <w:tc>
-          <w:tcPr>
-            <w:tcW w:type="dxa" w:w="3168"/>
-            <w:shd w:fill="EBF3FA"/>
-            <w:tcMar>
-              <w:top w:w="70" w:type="dxa"/>
-              <w:bottom w:w="70" w:type="dxa"/>
-              <w:left w:w="100" w:type="dxa"/>
-              <w:right w:w="100" w:type="dxa"/>
-            </w:tcMar>
-          </w:tcPr>
-          <w:p>
-            <w:pPr>
-              <w:spacing w:before="0" w:after="0"/>
-            </w:pPr>
-            <w:r>
-              <w:rPr>
-                <w:rFonts w:ascii="Calibri" w:hAnsi="Calibri"/>
-                <w:b/>
-                <w:color w:val="212121"/>
+                <w:color w:val="182B49"/>
                 <w:sz w:val="20"/>
               </w:rPr>
               <w:t>Student Repository</w:t>
@@ -409,22 +383,21 @@
         </w:tc>
         <w:tc>
           <w:tcPr>
-            <w:tcW w:type="dxa" w:w="6480"/>
-            <w:shd w:fill="FAFAFA"/>
+            <w:tcW w:type="dxa" w:w="6624"/>
+            <w:shd w:fill="F8FAFC"/>
             <w:tcMar>
-              <w:top w:w="70" w:type="dxa"/>
-              <w:bottom w:w="70" w:type="dxa"/>
-              <w:left w:w="100" w:type="dxa"/>
-              <w:right w:w="100" w:type="dxa"/>
+              <w:top w:w="140" w:type="dxa"/>
+              <w:bottom w:w="140" w:type="dxa"/>
+              <w:left w:w="180" w:type="dxa"/>
+              <w:right w:w="180" w:type="dxa"/>
             </w:tcMar>
           </w:tcPr>
           <w:p>
             <w:pPr>
-              <w:spacing w:before="0" w:after="0"/>
+              <w:spacing w:after="40"/>
             </w:pPr>
             <w:r>
               <w:rPr>
-                <w:rFonts w:ascii="Calibri" w:hAnsi="Calibri"/>
                 <w:sz w:val="20"/>
               </w:rPr>
               <w:t>https://github.com/dev-raj-murari/GeminiApiComposeStarter</w:t>
@@ -441,73 +414,533 @@
     <w:p>
       <w:pPr>
         <w:pStyle w:val="Heading1"/>
-        <w:spacing w:before="280" w:after="120"/>
       </w:pPr>
       <w:r>
         <w:rPr>
-          <w:rFonts w:ascii="Calibri" w:hAnsi="Calibri"/>
-          <w:b/>
-          <w:color w:val="1565C0"/>
-          <w:sz w:val="32"/>
+          <w:color w:val="182B49"/>
         </w:rPr>
         <w:t>1. Executive Summary &amp; Problem Statement</w:t>
       </w:r>
     </w:p>
     <w:p>
       <w:r>
-        <w:t>This project delivers an enterprise-grade AI chatbot Android application built with Jetpack Compose, Material 3, and Google's Generative AI SDK (com.google.ai.client.generativeai), implemented by Devraj Murari (Roll Number: N066). The objective is to extend the Gemini Jetpack Compose Starter App into a secure, responsive, persistent, and accessible application adhering strictly to the SVKM's NMIMS Lab Manual specifications.</w:t>
+        <w:t xml:space="preserve">This project constitutes the formal submission for Lab Assignment 1 in Mobile Application Development by </w:t>
+      </w:r>
+      <w:r>
+        <w:rPr>
+          <w:b/>
+        </w:rPr>
+        <w:t>Devraj Murari (Roll Number: N066)</w:t>
+      </w:r>
+      <w:r>
+        <w:t>. The goal of this assignment is to engineer a secure, enterprise-ready AI chatbot on Android using Google's modern Gemini AI SDK (com.google.ai.client.generativeai) and Jetpack Compose Material 3 declarative UI architecture.</w:t>
+      </w:r>
+    </w:p>
+    <w:p>
+      <w:pPr>
+        <w:spacing w:after="80"/>
+      </w:pPr>
+    </w:p>
+    <w:p>
+      <w:pPr>
+        <w:pStyle w:val="ListBullet"/>
+        <w:spacing w:after="40"/>
+      </w:pPr>
+      <w:r>
+        <w:rPr>
+          <w:b/>
+          <w:color w:val="182B49"/>
+        </w:rPr>
+        <w:t xml:space="preserve">Zero-Leakage Security: </w:t>
+      </w:r>
+      <w:r>
+        <w:t>API keys strictly isolated in local.properties, encrypted at rest via hardware-backed AES-256-GCM Android Keystore, and decrypted only in volatile RAM on-demand.</w:t>
+      </w:r>
+    </w:p>
+    <w:p>
+      <w:pPr>
+        <w:pStyle w:val="ListBullet"/>
+        <w:spacing w:after="40"/>
+      </w:pPr>
+      <w:r>
+        <w:rPr>
+          <w:b/>
+          <w:color w:val="182B49"/>
+        </w:rPr>
+        <w:t xml:space="preserve">Material 3 Responsive UI: </w:t>
+      </w:r>
+      <w:r>
+        <w:t>LazyColumn chat stream with stable key diffing, animated auto-scroll, quick prompt chips, and WindowSizeClass multi-window layouts for phones and tablets.</w:t>
+      </w:r>
+    </w:p>
+    <w:p>
+      <w:pPr>
+        <w:pStyle w:val="ListBullet"/>
+        <w:spacing w:after="40"/>
+      </w:pPr>
+      <w:r>
+        <w:rPr>
+          <w:b/>
+          <w:color w:val="182B49"/>
+        </w:rPr>
+        <w:t xml:space="preserve">Robust Offline Persistence: </w:t>
+      </w:r>
+      <w:r>
+        <w:t>Transaction-safe persistent database storing complete chat logs and timestamp metadata across device reboots and configuration changes.</w:t>
+      </w:r>
+    </w:p>
+    <w:p>
+      <w:pPr>
+        <w:pStyle w:val="ListBullet"/>
+        <w:spacing w:after="40"/>
+      </w:pPr>
+      <w:r>
+        <w:rPr>
+          <w:b/>
+          <w:color w:val="182B49"/>
+        </w:rPr>
+        <w:t xml:space="preserve">User Customization: </w:t>
+      </w:r>
+      <w:r>
+        <w:t>Preferences DataStore managing customizable system instructions and AI creativity (temperature slider) through an interactive settings dialog.</w:t>
+      </w:r>
+    </w:p>
+    <w:p>
+      <w:pPr>
+        <w:pStyle w:val="ListBullet"/>
+        <w:spacing w:after="40"/>
+      </w:pPr>
+      <w:r>
+        <w:rPr>
+          <w:b/>
+          <w:color w:val="182B49"/>
+        </w:rPr>
+        <w:t xml:space="preserve">Speech-to-Text Modality: </w:t>
+      </w:r>
+      <w:r>
+        <w:t>Direct voice input using Android RecognizerIntent integrated with Jetpack Compose Activity Result contracts.</w:t>
+      </w:r>
+    </w:p>
+    <w:p>
+      <w:pPr>
+        <w:pStyle w:val="ListBullet"/>
+        <w:spacing w:after="40"/>
+      </w:pPr>
+      <w:r>
+        <w:rPr>
+          <w:b/>
+          <w:color w:val="182B49"/>
+        </w:rPr>
+        <w:t xml:space="preserve">Automated Quality Assurance: </w:t>
+      </w:r>
+      <w:r>
+        <w:t>Deterministic unit test suite (ChatViewModelTest.kt) passing 100% of test cases.</w:t>
+      </w:r>
+    </w:p>
+    <w:p>
+      <w:pPr>
+        <w:pStyle w:val="Heading1"/>
+      </w:pPr>
+      <w:r>
+        <w:rPr>
+          <w:color w:val="182B49"/>
+        </w:rPr>
+        <w:t>2. Application Architecture &amp; MVVM Pattern</w:t>
+      </w:r>
+    </w:p>
+    <w:p>
+      <w:r>
+        <w:t>The application is structured according to Google's official Android Architecture Guide, establishing clear separation of concerns across Presentation, Domain/ViewModel, and Data layers through Unidirectional Data Flow (UDF):</w:t>
       </w:r>
     </w:p>
     <w:tbl>
       <w:tblPr>
         <w:tblW w:type="auto" w:w="0"/>
         <w:jc w:val="center"/>
+        <w:tblLayout w:type="fixed"/>
         <w:tblLook w:firstColumn="1" w:firstRow="1" w:lastColumn="0" w:lastRow="0" w:noHBand="0" w:noVBand="1" w:val="04A0"/>
       </w:tblPr>
       <w:tblGrid>
-        <w:gridCol w:w="9936"/>
+        <w:gridCol w:w="3312"/>
+        <w:gridCol w:w="3312"/>
+        <w:gridCol w:w="3312"/>
       </w:tblGrid>
       <w:tr>
         <w:tc>
           <w:tcPr>
-            <w:tcW w:type="dxa" w:w="9936"/>
-            <w:shd w:fill="E3F2FD"/>
+            <w:tcW w:type="dxa" w:w="3312"/>
+            <w:shd w:fill="1E3A8A"/>
             <w:tcMar>
               <w:top w:w="140" w:type="dxa"/>
               <w:bottom w:w="140" w:type="dxa"/>
-              <w:left w:w="200" w:type="dxa"/>
-              <w:right w:w="200" w:type="dxa"/>
+              <w:left w:w="180" w:type="dxa"/>
+              <w:right w:w="180" w:type="dxa"/>
+            </w:tcMar>
+          </w:tcPr>
+          <w:p>
+            <w:r>
+              <w:rPr>
+                <w:b/>
+                <w:color w:val="FFFFFF"/>
+                <w:sz w:val="20"/>
+              </w:rPr>
+              <w:t>Layer</w:t>
+            </w:r>
+          </w:p>
+        </w:tc>
+        <w:tc>
+          <w:tcPr>
+            <w:tcW w:type="dxa" w:w="3312"/>
+            <w:shd w:fill="1E3A8A"/>
+            <w:tcMar>
+              <w:top w:w="140" w:type="dxa"/>
+              <w:bottom w:w="140" w:type="dxa"/>
+              <w:left w:w="180" w:type="dxa"/>
+              <w:right w:w="180" w:type="dxa"/>
+            </w:tcMar>
+          </w:tcPr>
+          <w:p>
+            <w:r>
+              <w:rPr>
+                <w:b/>
+                <w:color w:val="FFFFFF"/>
+                <w:sz w:val="20"/>
+              </w:rPr>
+              <w:t>Components / Classes</w:t>
+            </w:r>
+          </w:p>
+        </w:tc>
+        <w:tc>
+          <w:tcPr>
+            <w:tcW w:type="dxa" w:w="3312"/>
+            <w:shd w:fill="1E3A8A"/>
+            <w:tcMar>
+              <w:top w:w="140" w:type="dxa"/>
+              <w:bottom w:w="140" w:type="dxa"/>
+              <w:left w:w="180" w:type="dxa"/>
+              <w:right w:w="180" w:type="dxa"/>
+            </w:tcMar>
+          </w:tcPr>
+          <w:p>
+            <w:r>
+              <w:rPr>
+                <w:b/>
+                <w:color w:val="FFFFFF"/>
+                <w:sz w:val="20"/>
+              </w:rPr>
+              <w:t>Responsibilities &amp; Data Flow</w:t>
+            </w:r>
+          </w:p>
+        </w:tc>
+      </w:tr>
+      <w:tr>
+        <w:tc>
+          <w:tcPr>
+            <w:tcW w:type="dxa" w:w="2160"/>
+            <w:shd w:fill="F8FAFC"/>
+            <w:tcMar>
+              <w:top w:w="140" w:type="dxa"/>
+              <w:bottom w:w="140" w:type="dxa"/>
+              <w:left w:w="180" w:type="dxa"/>
+              <w:right w:w="180" w:type="dxa"/>
             </w:tcMar>
           </w:tcPr>
           <w:p>
             <w:pPr>
-              <w:spacing w:before="0" w:after="40"/>
+              <w:spacing w:after="40"/>
             </w:pPr>
             <w:r>
               <w:rPr>
-                <w:rFonts w:ascii="Calibri" w:hAnsi="Calibri"/>
                 <w:b/>
-                <w:color w:val="0D47A1"/>
-                <w:sz w:val="22"/>
+                <w:color w:val="182B49"/>
+                <w:sz w:val="19"/>
               </w:rPr>
-              <w:t>📌 Core Capabilities Implemented</w:t>
-              <w:br/>
+              <w:t>Presentation Layer</w:t>
             </w:r>
+          </w:p>
+        </w:tc>
+        <w:tc>
+          <w:tcPr>
+            <w:tcW w:type="dxa" w:w="3168"/>
+            <w:shd w:fill="F8FAFC"/>
+            <w:tcMar>
+              <w:top w:w="140" w:type="dxa"/>
+              <w:bottom w:w="140" w:type="dxa"/>
+              <w:left w:w="180" w:type="dxa"/>
+              <w:right w:w="180" w:type="dxa"/>
+            </w:tcMar>
+          </w:tcPr>
+          <w:p>
+            <w:pPr>
+              <w:spacing w:after="40"/>
+            </w:pPr>
             <w:r>
               <w:rPr>
-                <w:rFonts w:ascii="Calibri" w:hAnsi="Calibri"/>
-                <w:color w:val="263238"/>
-                <w:sz w:val="20"/>
+                <w:sz w:val="19"/>
               </w:rPr>
-              <w:t>• Mandatory API Key Security: Hardware-backed AES-256-GCM Android Keystore encryption at rest with on-demand in-memory decryption.</w:t>
+              <w:t>MainActivity.kt</w:t>
               <w:br/>
-              <w:t>• Declarative Jetpack Compose UI: Material 3 chat bubbles, LazyColumn with stable keys, animated auto-scrolling, and suggestion chips.</w:t>
+              <w:t>ChatScreen.kt</w:t>
               <w:br/>
-              <w:t>• Offline Persistence &amp; State Management: Room Database for offline chat persistence across restarts and Preferences DataStore for AI customization.</w:t>
+              <w:t>ChatBubble.kt</w:t>
               <w:br/>
-              <w:t>• Multimodal Voice Input: Speech recognition via Android RecognizerIntent.</w:t>
+              <w:t>ChatInputBar.kt</w:t>
               <w:br/>
-              <w:t>• Automated Verification: Unit testing with kotlinx-coroutines-test and UI testing with createComposeRule().</w:t>
+              <w:t>SettingsDialog.kt</w:t>
+            </w:r>
+          </w:p>
+        </w:tc>
+        <w:tc>
+          <w:tcPr>
+            <w:tcW w:type="dxa" w:w="4464"/>
+            <w:shd w:fill="F8FAFC"/>
+            <w:tcMar>
+              <w:top w:w="140" w:type="dxa"/>
+              <w:bottom w:w="140" w:type="dxa"/>
+              <w:left w:w="180" w:type="dxa"/>
+              <w:right w:w="180" w:type="dxa"/>
+            </w:tcMar>
+          </w:tcPr>
+          <w:p>
+            <w:pPr>
+              <w:spacing w:after="40"/>
+            </w:pPr>
+            <w:r>
+              <w:rPr>
+                <w:sz w:val="19"/>
+              </w:rPr>
+              <w:t>Declarative UI rendered with Jetpack Compose Material 3; observes StateFlow from ViewModel and emits user events (clicks, text input, speech triggers).</w:t>
+            </w:r>
+          </w:p>
+        </w:tc>
+      </w:tr>
+      <w:tr>
+        <w:tc>
+          <w:tcPr>
+            <w:tcW w:type="dxa" w:w="2160"/>
+            <w:shd w:fill="FFFFFF"/>
+            <w:tcMar>
+              <w:top w:w="140" w:type="dxa"/>
+              <w:bottom w:w="140" w:type="dxa"/>
+              <w:left w:w="180" w:type="dxa"/>
+              <w:right w:w="180" w:type="dxa"/>
+            </w:tcMar>
+          </w:tcPr>
+          <w:p>
+            <w:pPr>
+              <w:spacing w:after="40"/>
+            </w:pPr>
+            <w:r>
+              <w:rPr>
+                <w:b/>
+                <w:color w:val="182B49"/>
+                <w:sz w:val="19"/>
+              </w:rPr>
+              <w:t>ViewModel Layer</w:t>
+            </w:r>
+          </w:p>
+        </w:tc>
+        <w:tc>
+          <w:tcPr>
+            <w:tcW w:type="dxa" w:w="3168"/>
+            <w:shd w:fill="FFFFFF"/>
+            <w:tcMar>
+              <w:top w:w="140" w:type="dxa"/>
+              <w:bottom w:w="140" w:type="dxa"/>
+              <w:left w:w="180" w:type="dxa"/>
+              <w:right w:w="180" w:type="dxa"/>
+            </w:tcMar>
+          </w:tcPr>
+          <w:p>
+            <w:pPr>
+              <w:spacing w:after="40"/>
+            </w:pPr>
+            <w:r>
+              <w:rPr>
+                <w:sz w:val="19"/>
+              </w:rPr>
+              <w:t>ChatViewModel.kt</w:t>
+              <w:br/>
+              <w:t>ChatUiState.kt</w:t>
+            </w:r>
+          </w:p>
+        </w:tc>
+        <w:tc>
+          <w:tcPr>
+            <w:tcW w:type="dxa" w:w="4464"/>
+            <w:shd w:fill="FFFFFF"/>
+            <w:tcMar>
+              <w:top w:w="140" w:type="dxa"/>
+              <w:bottom w:w="140" w:type="dxa"/>
+              <w:left w:w="180" w:type="dxa"/>
+              <w:right w:w="180" w:type="dxa"/>
+            </w:tcMar>
+          </w:tcPr>
+          <w:p>
+            <w:pPr>
+              <w:spacing w:after="40"/>
+            </w:pPr>
+            <w:r>
+              <w:rPr>
+                <w:sz w:val="19"/>
+              </w:rPr>
+              <w:t>Manages state as immutable ChatUiState StateFlow; coordinates coroutine scopes, handles input validation, and invokes repository methods.</w:t>
+            </w:r>
+          </w:p>
+        </w:tc>
+      </w:tr>
+      <w:tr>
+        <w:tc>
+          <w:tcPr>
+            <w:tcW w:type="dxa" w:w="2160"/>
+            <w:shd w:fill="F8FAFC"/>
+            <w:tcMar>
+              <w:top w:w="140" w:type="dxa"/>
+              <w:bottom w:w="140" w:type="dxa"/>
+              <w:left w:w="180" w:type="dxa"/>
+              <w:right w:w="180" w:type="dxa"/>
+            </w:tcMar>
+          </w:tcPr>
+          <w:p>
+            <w:pPr>
+              <w:spacing w:after="40"/>
+            </w:pPr>
+            <w:r>
+              <w:rPr>
+                <w:b/>
+                <w:color w:val="182B49"/>
+                <w:sz w:val="19"/>
+              </w:rPr>
+              <w:t>Data Layer</w:t>
+            </w:r>
+          </w:p>
+        </w:tc>
+        <w:tc>
+          <w:tcPr>
+            <w:tcW w:type="dxa" w:w="3168"/>
+            <w:shd w:fill="F8FAFC"/>
+            <w:tcMar>
+              <w:top w:w="140" w:type="dxa"/>
+              <w:bottom w:w="140" w:type="dxa"/>
+              <w:left w:w="180" w:type="dxa"/>
+              <w:right w:w="180" w:type="dxa"/>
+            </w:tcMar>
+          </w:tcPr>
+          <w:p>
+            <w:pPr>
+              <w:spacing w:after="40"/>
+            </w:pPr>
+            <w:r>
+              <w:rPr>
+                <w:sz w:val="19"/>
+              </w:rPr>
+              <w:t>GeminiRepository.kt</w:t>
+              <w:br/>
+              <w:t>GeminiRepositoryImpl.kt</w:t>
+            </w:r>
+          </w:p>
+        </w:tc>
+        <w:tc>
+          <w:tcPr>
+            <w:tcW w:type="dxa" w:w="4464"/>
+            <w:shd w:fill="F8FAFC"/>
+            <w:tcMar>
+              <w:top w:w="140" w:type="dxa"/>
+              <w:bottom w:w="140" w:type="dxa"/>
+              <w:left w:w="180" w:type="dxa"/>
+              <w:right w:w="180" w:type="dxa"/>
+            </w:tcMar>
+          </w:tcPr>
+          <w:p>
+            <w:pPr>
+              <w:spacing w:after="40"/>
+            </w:pPr>
+            <w:r>
+              <w:rPr>
+                <w:sz w:val="19"/>
+              </w:rPr>
+              <w:t>Single source of truth. Orchestrates in-memory API key decryption, Google Generative AI SDK calls, and persistent database queries.</w:t>
+            </w:r>
+          </w:p>
+        </w:tc>
+      </w:tr>
+      <w:tr>
+        <w:tc>
+          <w:tcPr>
+            <w:tcW w:type="dxa" w:w="2160"/>
+            <w:shd w:fill="FFFFFF"/>
+            <w:tcMar>
+              <w:top w:w="140" w:type="dxa"/>
+              <w:bottom w:w="140" w:type="dxa"/>
+              <w:left w:w="180" w:type="dxa"/>
+              <w:right w:w="180" w:type="dxa"/>
+            </w:tcMar>
+          </w:tcPr>
+          <w:p>
+            <w:pPr>
+              <w:spacing w:after="40"/>
+            </w:pPr>
+            <w:r>
+              <w:rPr>
+                <w:b/>
+                <w:color w:val="182B49"/>
+                <w:sz w:val="19"/>
+              </w:rPr>
+              <w:t>Local Persistence &amp; Security</w:t>
+            </w:r>
+          </w:p>
+        </w:tc>
+        <w:tc>
+          <w:tcPr>
+            <w:tcW w:type="dxa" w:w="3168"/>
+            <w:shd w:fill="FFFFFF"/>
+            <w:tcMar>
+              <w:top w:w="140" w:type="dxa"/>
+              <w:bottom w:w="140" w:type="dxa"/>
+              <w:left w:w="180" w:type="dxa"/>
+              <w:right w:w="180" w:type="dxa"/>
+            </w:tcMar>
+          </w:tcPr>
+          <w:p>
+            <w:pPr>
+              <w:spacing w:after="40"/>
+            </w:pPr>
+            <w:r>
+              <w:rPr>
+                <w:sz w:val="19"/>
+              </w:rPr>
+              <w:t>AppDatabase.kt</w:t>
+              <w:br/>
+              <w:t>ChatMessageDao.kt</w:t>
+              <w:br/>
+              <w:t>PreferencesManager.kt</w:t>
+              <w:br/>
+              <w:t>KeystoreHelper.kt</w:t>
+              <w:br/>
+              <w:t>SecureKeyStorage.kt</w:t>
+            </w:r>
+          </w:p>
+        </w:tc>
+        <w:tc>
+          <w:tcPr>
+            <w:tcW w:type="dxa" w:w="4464"/>
+            <w:shd w:fill="FFFFFF"/>
+            <w:tcMar>
+              <w:top w:w="140" w:type="dxa"/>
+              <w:bottom w:w="140" w:type="dxa"/>
+              <w:left w:w="180" w:type="dxa"/>
+              <w:right w:w="180" w:type="dxa"/>
+            </w:tcMar>
+          </w:tcPr>
+          <w:p>
+            <w:pPr>
+              <w:spacing w:after="40"/>
+            </w:pPr>
+            <w:r>
+              <w:rPr>
+                <w:sz w:val="19"/>
+              </w:rPr>
+              <w:t>Hardware-backed AES-256-GCM encryption in AndroidKeyStore, DataStore for preferences, and SQLite transactional storage.</w:t>
             </w:r>
           </w:p>
         </w:tc>
@@ -515,121 +948,1081 @@
     </w:tbl>
     <w:p>
       <w:pPr>
-        <w:spacing w:before="0" w:after="120"/>
+        <w:spacing w:after="120"/>
       </w:pPr>
     </w:p>
     <w:p>
       <w:pPr>
         <w:pStyle w:val="Heading1"/>
-        <w:spacing w:before="280" w:after="120"/>
       </w:pPr>
       <w:r>
         <w:rPr>
-          <w:rFonts w:ascii="Calibri" w:hAnsi="Calibri"/>
-          <w:b/>
-          <w:color w:val="1565C0"/>
-          <w:sz w:val="32"/>
+          <w:color w:val="182B49"/>
         </w:rPr>
-        <w:t>2. Architecture &amp; System Design</w:t>
+        <w:t>3. Hardware Keystore Encryption &amp; API Key Isolation</w:t>
       </w:r>
     </w:p>
     <w:p>
       <w:r>
-        <w:t>The application is architected following Google's official Android Architecture Guidelines implementing MVVM (Model-View-ViewModel) and the Repository Pattern with clean separation across layers under package com.devraj.geminiassistant:</w:t>
+        <w:t>A cornerstone requirement of this assignment is uncompromising security for the Gemini API key. The project eliminates static hardcoded keys through a multi-tiered security pipeline:</w:t>
+      </w:r>
+    </w:p>
+    <w:p>
+      <w:pPr>
+        <w:pStyle w:val="ListBullet"/>
+        <w:spacing w:after="40"/>
+      </w:pPr>
+      <w:r>
+        <w:rPr>
+          <w:b/>
+          <w:color w:val="182B49"/>
+        </w:rPr>
+        <w:t xml:space="preserve">1. Git-Ignored Configuration: </w:t>
+      </w:r>
+      <w:r>
+        <w:t>The key is defined solely in local.properties (GEMINI_API_KEY=...) and excluded from version control.</w:t>
+      </w:r>
+    </w:p>
+    <w:p>
+      <w:pPr>
+        <w:pStyle w:val="ListBullet"/>
+        <w:spacing w:after="40"/>
+      </w:pPr>
+      <w:r>
+        <w:rPr>
+          <w:b/>
+          <w:color w:val="182B49"/>
+        </w:rPr>
+        <w:t xml:space="preserve">2. Hardware-Backed AES-256-GCM Key Generation: </w:t>
+      </w:r>
+      <w:r>
+        <w:t>KeystoreHelper.kt generates an AES-256 key within the hardware AndroidKeyStore (Secure Element / TEE) with GCM mode and randomized IVs.</w:t>
+      </w:r>
+    </w:p>
+    <w:p>
+      <w:pPr>
+        <w:pStyle w:val="ListBullet"/>
+        <w:spacing w:after="40"/>
+      </w:pPr>
+      <w:r>
+        <w:rPr>
+          <w:b/>
+          <w:color w:val="182B49"/>
+        </w:rPr>
+        <w:t xml:space="preserve">3. Encrypted at Rest: </w:t>
+      </w:r>
+      <w:r>
+        <w:t>SecureKeyStorage.kt stores the encrypted ciphertext and IV in private app storage upon first initialization.</w:t>
+      </w:r>
+    </w:p>
+    <w:p>
+      <w:pPr>
+        <w:pStyle w:val="ListBullet"/>
+        <w:spacing w:after="40"/>
+      </w:pPr>
+      <w:r>
+        <w:rPr>
+          <w:b/>
+          <w:color w:val="182B49"/>
+        </w:rPr>
+        <w:t xml:space="preserve">4. In-Memory Decryption Only: </w:t>
+      </w:r>
+      <w:r>
+        <w:t>Plaintext credentials reside in memory strictly during GenerativeModel initialization and are never written to disk or exposed in error logs.</w:t>
+      </w:r>
+    </w:p>
+    <w:p>
+      <w:pPr>
+        <w:pStyle w:val="ListBullet"/>
+        <w:spacing w:after="40"/>
+      </w:pPr>
+      <w:r>
+        <w:rPr>
+          <w:b/>
+          <w:color w:val="182B49"/>
+        </w:rPr>
+        <w:t xml:space="preserve">5. R8 Minification: </w:t>
+      </w:r>
+      <w:r>
+        <w:t>Release builds enforce minifyEnabled = true with ProGuard optimization rules to obfuscate class and method symbols.</w:t>
+      </w:r>
+    </w:p>
+    <w:p>
+      <w:pPr>
+        <w:spacing w:after="120"/>
+      </w:pPr>
+    </w:p>
+    <w:p>
+      <w:pPr>
+        <w:pStyle w:val="Heading1"/>
+      </w:pPr>
+      <w:r>
+        <w:rPr>
+          <w:color w:val="182B49"/>
+        </w:rPr>
+        <w:t>4. Visual Verification &amp; Application Screenshots</w:t>
+      </w:r>
+    </w:p>
+    <w:p>
+      <w:r>
+        <w:t>The following screenshots demonstrate the Gemini AI Assistant running live on the Android Studio Pixel 8 Emulator (API 37.1) with all features actively verified for Devraj Murari (N066):</w:t>
+      </w:r>
+    </w:p>
+    <w:p>
+      <w:pPr>
+        <w:spacing w:after="40"/>
+      </w:pPr>
+      <w:r>
+        <w:rPr>
+          <w:b/>
+          <w:color w:val="182B49"/>
+        </w:rPr>
+        <w:t>Figure 4.1: Initial Welcome Screen with Student Identification &amp; Quick Suggestion Chips</w:t>
+      </w:r>
+    </w:p>
+    <w:p>
+      <w:pPr>
+        <w:spacing w:after="80"/>
+        <w:jc w:val="center"/>
+      </w:pPr>
+      <w:r>
+        <w:drawing>
+          <wp:inline xmlns:a="http://schemas.openxmlformats.org/drawingml/2006/main" xmlns:pic="http://schemas.openxmlformats.org/drawingml/2006/picture">
+            <wp:extent cx="2926080" cy="5008605"/>
+            <wp:docPr id="1" name="Picture 1"/>
+            <wp:cNvGraphicFramePr>
+              <a:graphicFrameLocks noChangeAspect="1"/>
+            </wp:cNvGraphicFramePr>
+            <a:graphic>
+              <a:graphicData uri="http://schemas.openxmlformats.org/drawingml/2006/picture">
+                <pic:pic>
+                  <pic:nvPicPr>
+                    <pic:cNvPr id="0" name="media_1790152979895.png"/>
+                    <pic:cNvPicPr/>
+                  </pic:nvPicPr>
+                  <pic:blipFill>
+                    <a:blip r:embed="rId9"/>
+                    <a:stretch>
+                      <a:fillRect/>
+                    </a:stretch>
+                  </pic:blipFill>
+                  <pic:spPr>
+                    <a:xfrm>
+                      <a:off x="0" y="0"/>
+                      <a:ext cx="2926080" cy="5008605"/>
+                    </a:xfrm>
+                    <a:prstGeom prst="rect"/>
+                  </pic:spPr>
+                </pic:pic>
+              </a:graphicData>
+            </a:graphic>
+          </wp:inline>
+        </w:drawing>
+      </w:r>
+    </w:p>
+    <w:p>
+      <w:pPr>
+        <w:spacing w:after="40"/>
+      </w:pPr>
+      <w:r>
+        <w:rPr>
+          <w:b/>
+          <w:color w:val="182B49"/>
+        </w:rPr>
+        <w:t>Figure 4.2: Live Multi-Turn AI Conversation (Gemini AI Generative Model)</w:t>
+      </w:r>
+    </w:p>
+    <w:p>
+      <w:pPr>
+        <w:spacing w:after="80"/>
+        <w:jc w:val="center"/>
+      </w:pPr>
+      <w:r>
+        <w:drawing>
+          <wp:inline xmlns:a="http://schemas.openxmlformats.org/drawingml/2006/main" xmlns:pic="http://schemas.openxmlformats.org/drawingml/2006/picture">
+            <wp:extent cx="2926080" cy="4540968"/>
+            <wp:docPr id="2" name="Picture 2"/>
+            <wp:cNvGraphicFramePr>
+              <a:graphicFrameLocks noChangeAspect="1"/>
+            </wp:cNvGraphicFramePr>
+            <a:graphic>
+              <a:graphicData uri="http://schemas.openxmlformats.org/drawingml/2006/picture">
+                <pic:pic>
+                  <pic:nvPicPr>
+                    <pic:cNvPr id="0" name="media_1790152979908.png"/>
+                    <pic:cNvPicPr/>
+                  </pic:nvPicPr>
+                  <pic:blipFill>
+                    <a:blip r:embed="rId10"/>
+                    <a:stretch>
+                      <a:fillRect/>
+                    </a:stretch>
+                  </pic:blipFill>
+                  <pic:spPr>
+                    <a:xfrm>
+                      <a:off x="0" y="0"/>
+                      <a:ext cx="2926080" cy="4540968"/>
+                    </a:xfrm>
+                    <a:prstGeom prst="rect"/>
+                  </pic:spPr>
+                </pic:pic>
+              </a:graphicData>
+            </a:graphic>
+          </wp:inline>
+        </w:drawing>
+      </w:r>
+    </w:p>
+    <w:p>
+      <w:pPr>
+        <w:spacing w:after="40"/>
+      </w:pPr>
+      <w:r>
+        <w:rPr>
+          <w:b/>
+          <w:color w:val="182B49"/>
+        </w:rPr>
+        <w:t>Figure 4.3: Assistant Preferences Settings Dialog (Custom System Prompt &amp; Creativity Slider)</w:t>
+      </w:r>
+    </w:p>
+    <w:p>
+      <w:pPr>
+        <w:spacing w:after="80"/>
+        <w:jc w:val="center"/>
+      </w:pPr>
+      <w:r>
+        <w:drawing>
+          <wp:inline xmlns:a="http://schemas.openxmlformats.org/drawingml/2006/main" xmlns:pic="http://schemas.openxmlformats.org/drawingml/2006/picture">
+            <wp:extent cx="2560320" cy="5689600"/>
+            <wp:docPr id="3" name="Picture 3"/>
+            <wp:cNvGraphicFramePr>
+              <a:graphicFrameLocks noChangeAspect="1"/>
+            </wp:cNvGraphicFramePr>
+            <a:graphic>
+              <a:graphicData uri="http://schemas.openxmlformats.org/drawingml/2006/picture">
+                <pic:pic>
+                  <pic:nvPicPr>
+                    <pic:cNvPr id="0" name="screenshot_02_settings.png"/>
+                    <pic:cNvPicPr/>
+                  </pic:nvPicPr>
+                  <pic:blipFill>
+                    <a:blip r:embed="rId11"/>
+                    <a:stretch>
+                      <a:fillRect/>
+                    </a:stretch>
+                  </pic:blipFill>
+                  <pic:spPr>
+                    <a:xfrm>
+                      <a:off x="0" y="0"/>
+                      <a:ext cx="2560320" cy="5689600"/>
+                    </a:xfrm>
+                    <a:prstGeom prst="rect"/>
+                  </pic:spPr>
+                </pic:pic>
+              </a:graphicData>
+            </a:graphic>
+          </wp:inline>
+        </w:drawing>
+      </w:r>
+    </w:p>
+    <w:p>
+      <w:pPr>
+        <w:spacing w:after="120"/>
+      </w:pPr>
+    </w:p>
+    <w:p>
+      <w:pPr>
+        <w:pStyle w:val="Heading1"/>
+      </w:pPr>
+      <w:r>
+        <w:rPr>
+          <w:color w:val="182B49"/>
+        </w:rPr>
+        <w:t>5. Automated Unit &amp; UI Testing Results</w:t>
+      </w:r>
+    </w:p>
+    <w:p>
+      <w:r>
+        <w:t>A comprehensive test suite was executed via Gradle (./gradlew testDebugUnitTest) verifying ViewModel state mutations, voice STT input handling, repository error propagation, and settings persistence. All tests passed with 100% success rate:</w:t>
       </w:r>
     </w:p>
     <w:tbl>
       <w:tblPr>
         <w:tblW w:type="auto" w:w="0"/>
         <w:jc w:val="center"/>
+        <w:tblLayout w:type="fixed"/>
         <w:tblLook w:firstColumn="1" w:firstRow="1" w:lastColumn="0" w:lastRow="0" w:noHBand="0" w:noVBand="1" w:val="04A0"/>
       </w:tblPr>
       <w:tblGrid>
-        <w:gridCol w:w="9936"/>
+        <w:gridCol w:w="2484"/>
+        <w:gridCol w:w="2484"/>
+        <w:gridCol w:w="2484"/>
+        <w:gridCol w:w="2484"/>
       </w:tblGrid>
       <w:tr>
         <w:tc>
           <w:tcPr>
-            <w:tcW w:type="dxa" w:w="9936"/>
-            <w:shd w:fill="F4F6F9"/>
+            <w:tcW w:type="dxa" w:w="2484"/>
+            <w:shd w:fill="1E3A8A"/>
             <w:tcMar>
-              <w:top w:w="120" w:type="dxa"/>
-              <w:bottom w:w="120" w:type="dxa"/>
+              <w:top w:w="140" w:type="dxa"/>
+              <w:bottom w:w="140" w:type="dxa"/>
+              <w:left w:w="180" w:type="dxa"/>
+              <w:right w:w="180" w:type="dxa"/>
+            </w:tcMar>
+          </w:tcPr>
+          <w:p>
+            <w:r>
+              <w:rPr>
+                <w:b/>
+                <w:color w:val="FFFFFF"/>
+                <w:sz w:val="19"/>
+              </w:rPr>
+              <w:t>Test Method Name</w:t>
+            </w:r>
+          </w:p>
+        </w:tc>
+        <w:tc>
+          <w:tcPr>
+            <w:tcW w:type="dxa" w:w="2484"/>
+            <w:shd w:fill="1E3A8A"/>
+            <w:tcMar>
+              <w:top w:w="140" w:type="dxa"/>
+              <w:bottom w:w="140" w:type="dxa"/>
+              <w:left w:w="180" w:type="dxa"/>
+              <w:right w:w="180" w:type="dxa"/>
+            </w:tcMar>
+          </w:tcPr>
+          <w:p>
+            <w:r>
+              <w:rPr>
+                <w:b/>
+                <w:color w:val="FFFFFF"/>
+                <w:sz w:val="19"/>
+              </w:rPr>
+              <w:t>Tested Component</w:t>
+            </w:r>
+          </w:p>
+        </w:tc>
+        <w:tc>
+          <w:tcPr>
+            <w:tcW w:type="dxa" w:w="2484"/>
+            <w:shd w:fill="1E3A8A"/>
+            <w:tcMar>
+              <w:top w:w="140" w:type="dxa"/>
+              <w:bottom w:w="140" w:type="dxa"/>
+              <w:left w:w="180" w:type="dxa"/>
+              <w:right w:w="180" w:type="dxa"/>
+            </w:tcMar>
+          </w:tcPr>
+          <w:p>
+            <w:r>
+              <w:rPr>
+                <w:b/>
+                <w:color w:val="FFFFFF"/>
+                <w:sz w:val="19"/>
+              </w:rPr>
+              <w:t>Expected Behavior</w:t>
+            </w:r>
+          </w:p>
+        </w:tc>
+        <w:tc>
+          <w:tcPr>
+            <w:tcW w:type="dxa" w:w="2484"/>
+            <w:shd w:fill="1E3A8A"/>
+            <w:tcMar>
+              <w:top w:w="140" w:type="dxa"/>
+              <w:bottom w:w="140" w:type="dxa"/>
+              <w:left w:w="180" w:type="dxa"/>
+              <w:right w:w="180" w:type="dxa"/>
+            </w:tcMar>
+          </w:tcPr>
+          <w:p>
+            <w:r>
+              <w:rPr>
+                <w:b/>
+                <w:color w:val="FFFFFF"/>
+                <w:sz w:val="19"/>
+              </w:rPr>
+              <w:t>Status</w:t>
+            </w:r>
+          </w:p>
+        </w:tc>
+      </w:tr>
+      <w:tr>
+        <w:tc>
+          <w:tcPr>
+            <w:tcW w:type="dxa" w:w="3744"/>
+            <w:shd w:fill="F8FAFC"/>
+            <w:tcMar>
+              <w:top w:w="140" w:type="dxa"/>
+              <w:bottom w:w="140" w:type="dxa"/>
               <w:left w:w="180" w:type="dxa"/>
               <w:right w:w="180" w:type="dxa"/>
             </w:tcMar>
           </w:tcPr>
           <w:p>
             <w:pPr>
-              <w:spacing w:before="0" w:after="0"/>
+              <w:spacing w:after="40"/>
             </w:pPr>
             <w:r>
               <w:rPr>
-                <w:rFonts w:ascii="Consolas" w:hAnsi="Consolas"/>
-                <w:color w:val="212121"/>
-                <w:sz w:val="19"/>
+                <w:b/>
+                <w:sz w:val="18"/>
               </w:rPr>
-              <w:t>+-----------------------------------------------------------------------+</w:t>
-              <w:br/>
-              <w:t>|                         PRESENTATION LAYER (Compose)                  |</w:t>
-              <w:br/>
-              <w:t>|  - MainActivity.kt (WindowSizeClass calculation &amp; theme injection)     |</w:t>
-              <w:br/>
-              <w:t>|  - ChatScreen.kt (Scaffold, TopAppBar, LazyColumn, Responsive layout) |</w:t>
-              <w:br/>
-              <w:t>|  - ChatBubble.kt (Material 3 bubble cards, formatted timestamps)      |</w:t>
-              <w:br/>
-              <w:t>|  - ChatInputBar.kt (Outlined input, mic trigger, animated actions)    |</w:t>
-              <w:br/>
-              <w:t>|  - SettingsDialog.kt (System prompt &amp; temperature configuration)      |</w:t>
-              <w:br/>
-              <w:t>+-----------------------------------------------------------------------+</w:t>
-              <w:br/>
-              <w:t xml:space="preserve">                                   |</w:t>
-              <w:br/>
-              <w:t xml:space="preserve">                       Collects StateFlow / Sends Events</w:t>
-              <w:br/>
-              <w:t xml:space="preserve">                                   v</w:t>
-              <w:br/>
-              <w:t>+-----------------------------------------------------------------------+</w:t>
-              <w:br/>
-              <w:t>|                         VIEWMODEL LAYER                               |</w:t>
-              <w:br/>
-              <w:t>|  - ChatViewModel.kt (StateFlow&lt;ChatUiState&gt;, coroutine dispatchers)   |</w:t>
-              <w:br/>
-              <w:t>|  - ChatUiState.kt (Immutable UI data model)                           |</w:t>
-              <w:br/>
-              <w:t>+-----------------------------------------------------------------------+</w:t>
-              <w:br/>
-              <w:t xml:space="preserve">                                   |</w:t>
-              <w:br/>
-              <w:t xml:space="preserve">                           Coroutines / Flow</w:t>
-              <w:br/>
-              <w:t xml:space="preserve">                                   v</w:t>
-              <w:br/>
-              <w:t>+-----------------------------------------------------------------------+</w:t>
-              <w:br/>
-              <w:t>|                         DATA &amp; REPOSITORY LAYER                       |</w:t>
-              <w:br/>
-              <w:t>|  - GeminiRepository.kt (Interface)                                    |</w:t>
-              <w:br/>
-              <w:t>|  - GeminiRepositoryImpl.kt (Orchestrates Gemini, Room, DataStore)     |</w:t>
-              <w:br/>
-              <w:t>+-----------------------------------------------------------------------+</w:t>
-              <w:br/>
-              <w:t xml:space="preserve">       |                                   |                    |</w:t>
-              <w:br/>
-              <w:t xml:space="preserve">       v                                   v                    v</w:t>
-              <w:br/>
-              <w:t>+-----------------------+     +-----------------------+ +---------------+</w:t>
-              <w:br/>
-              <w:t>|  Google Generative AI |     |     Room Database     | | DataStore &amp;   |</w:t>
-              <w:br/>
-              <w:t>|  SDK (GenerativeModel)|     | (ChatMessageDao / DB) | | Keystore      |</w:t>
-              <w:br/>
-              <w:t>|  (In-Memory API Key)  |     |  Survives App Restarts| | (AES-256-GCM) |</w:t>
-              <w:br/>
-              <w:t>+-----------------------+     +-----------------------+ +---------------+</w:t>
+              <w:t>initial_state_has_empty_messages_and_default_settings</w:t>
+            </w:r>
+          </w:p>
+        </w:tc>
+        <w:tc>
+          <w:tcPr>
+            <w:tcW w:type="dxa" w:w="1872"/>
+            <w:shd w:fill="F8FAFC"/>
+            <w:tcMar>
+              <w:top w:w="140" w:type="dxa"/>
+              <w:bottom w:w="140" w:type="dxa"/>
+              <w:left w:w="180" w:type="dxa"/>
+              <w:right w:w="180" w:type="dxa"/>
+            </w:tcMar>
+          </w:tcPr>
+          <w:p>
+            <w:pPr>
+              <w:spacing w:after="40"/>
+            </w:pPr>
+            <w:r>
+              <w:rPr>
+                <w:sz w:val="18"/>
+              </w:rPr>
+              <w:t>ChatViewModel</w:t>
+            </w:r>
+          </w:p>
+        </w:tc>
+        <w:tc>
+          <w:tcPr>
+            <w:tcW w:type="dxa" w:w="3024"/>
+            <w:shd w:fill="F8FAFC"/>
+            <w:tcMar>
+              <w:top w:w="140" w:type="dxa"/>
+              <w:bottom w:w="140" w:type="dxa"/>
+              <w:left w:w="180" w:type="dxa"/>
+              <w:right w:w="180" w:type="dxa"/>
+            </w:tcMar>
+          </w:tcPr>
+          <w:p>
+            <w:pPr>
+              <w:spacing w:after="40"/>
+            </w:pPr>
+            <w:r>
+              <w:rPr>
+                <w:sz w:val="18"/>
+              </w:rPr>
+              <w:t>Emits empty message list, default instruction &amp; 0.7f temperature</w:t>
+            </w:r>
+          </w:p>
+        </w:tc>
+        <w:tc>
+          <w:tcPr>
+            <w:tcW w:type="dxa" w:w="1152"/>
+            <w:shd w:fill="F8FAFC"/>
+            <w:tcMar>
+              <w:top w:w="140" w:type="dxa"/>
+              <w:bottom w:w="140" w:type="dxa"/>
+              <w:left w:w="180" w:type="dxa"/>
+              <w:right w:w="180" w:type="dxa"/>
+            </w:tcMar>
+          </w:tcPr>
+          <w:p>
+            <w:pPr>
+              <w:spacing w:after="40"/>
+            </w:pPr>
+            <w:r>
+              <w:rPr>
+                <w:b/>
+                <w:color w:val="27AE60"/>
+                <w:sz w:val="18"/>
+              </w:rPr>
+              <w:t>PASSED (100%)</w:t>
+            </w:r>
+          </w:p>
+        </w:tc>
+      </w:tr>
+      <w:tr>
+        <w:tc>
+          <w:tcPr>
+            <w:tcW w:type="dxa" w:w="3744"/>
+            <w:shd w:fill="FFFFFF"/>
+            <w:tcMar>
+              <w:top w:w="140" w:type="dxa"/>
+              <w:bottom w:w="140" w:type="dxa"/>
+              <w:left w:w="180" w:type="dxa"/>
+              <w:right w:w="180" w:type="dxa"/>
+            </w:tcMar>
+          </w:tcPr>
+          <w:p>
+            <w:pPr>
+              <w:spacing w:after="40"/>
+            </w:pPr>
+            <w:r>
+              <w:rPr>
+                <w:b/>
+                <w:sz w:val="18"/>
+              </w:rPr>
+              <w:t>onPromptChange_updates_prompt_correctly</w:t>
+            </w:r>
+          </w:p>
+        </w:tc>
+        <w:tc>
+          <w:tcPr>
+            <w:tcW w:type="dxa" w:w="1872"/>
+            <w:shd w:fill="FFFFFF"/>
+            <w:tcMar>
+              <w:top w:w="140" w:type="dxa"/>
+              <w:bottom w:w="140" w:type="dxa"/>
+              <w:left w:w="180" w:type="dxa"/>
+              <w:right w:w="180" w:type="dxa"/>
+            </w:tcMar>
+          </w:tcPr>
+          <w:p>
+            <w:pPr>
+              <w:spacing w:after="40"/>
+            </w:pPr>
+            <w:r>
+              <w:rPr>
+                <w:sz w:val="18"/>
+              </w:rPr>
+              <w:t>ChatViewModel</w:t>
+            </w:r>
+          </w:p>
+        </w:tc>
+        <w:tc>
+          <w:tcPr>
+            <w:tcW w:type="dxa" w:w="3024"/>
+            <w:shd w:fill="FFFFFF"/>
+            <w:tcMar>
+              <w:top w:w="140" w:type="dxa"/>
+              <w:bottom w:w="140" w:type="dxa"/>
+              <w:left w:w="180" w:type="dxa"/>
+              <w:right w:w="180" w:type="dxa"/>
+            </w:tcMar>
+          </w:tcPr>
+          <w:p>
+            <w:pPr>
+              <w:spacing w:after="40"/>
+            </w:pPr>
+            <w:r>
+              <w:rPr>
+                <w:sz w:val="18"/>
+              </w:rPr>
+              <w:t>Updates prompt state string and clears prompt error</w:t>
+            </w:r>
+          </w:p>
+        </w:tc>
+        <w:tc>
+          <w:tcPr>
+            <w:tcW w:type="dxa" w:w="1152"/>
+            <w:shd w:fill="FFFFFF"/>
+            <w:tcMar>
+              <w:top w:w="140" w:type="dxa"/>
+              <w:bottom w:w="140" w:type="dxa"/>
+              <w:left w:w="180" w:type="dxa"/>
+              <w:right w:w="180" w:type="dxa"/>
+            </w:tcMar>
+          </w:tcPr>
+          <w:p>
+            <w:pPr>
+              <w:spacing w:after="40"/>
+            </w:pPr>
+            <w:r>
+              <w:rPr>
+                <w:b/>
+                <w:color w:val="27AE60"/>
+                <w:sz w:val="18"/>
+              </w:rPr>
+              <w:t>PASSED (100%)</w:t>
+            </w:r>
+          </w:p>
+        </w:tc>
+      </w:tr>
+      <w:tr>
+        <w:tc>
+          <w:tcPr>
+            <w:tcW w:type="dxa" w:w="3744"/>
+            <w:shd w:fill="F8FAFC"/>
+            <w:tcMar>
+              <w:top w:w="140" w:type="dxa"/>
+              <w:bottom w:w="140" w:type="dxa"/>
+              <w:left w:w="180" w:type="dxa"/>
+              <w:right w:w="180" w:type="dxa"/>
+            </w:tcMar>
+          </w:tcPr>
+          <w:p>
+            <w:pPr>
+              <w:spacing w:after="40"/>
+            </w:pPr>
+            <w:r>
+              <w:rPr>
+                <w:b/>
+                <w:sz w:val="18"/>
+              </w:rPr>
+              <w:t>onVoiceResult_updates_prompt_from_speech_recognition</w:t>
+            </w:r>
+          </w:p>
+        </w:tc>
+        <w:tc>
+          <w:tcPr>
+            <w:tcW w:type="dxa" w:w="1872"/>
+            <w:shd w:fill="F8FAFC"/>
+            <w:tcMar>
+              <w:top w:w="140" w:type="dxa"/>
+              <w:bottom w:w="140" w:type="dxa"/>
+              <w:left w:w="180" w:type="dxa"/>
+              <w:right w:w="180" w:type="dxa"/>
+            </w:tcMar>
+          </w:tcPr>
+          <w:p>
+            <w:pPr>
+              <w:spacing w:after="40"/>
+            </w:pPr>
+            <w:r>
+              <w:rPr>
+                <w:sz w:val="18"/>
+              </w:rPr>
+              <w:t>ChatViewModel / Voice STT</w:t>
+            </w:r>
+          </w:p>
+        </w:tc>
+        <w:tc>
+          <w:tcPr>
+            <w:tcW w:type="dxa" w:w="3024"/>
+            <w:shd w:fill="F8FAFC"/>
+            <w:tcMar>
+              <w:top w:w="140" w:type="dxa"/>
+              <w:bottom w:w="140" w:type="dxa"/>
+              <w:left w:w="180" w:type="dxa"/>
+              <w:right w:w="180" w:type="dxa"/>
+            </w:tcMar>
+          </w:tcPr>
+          <w:p>
+            <w:pPr>
+              <w:spacing w:after="40"/>
+            </w:pPr>
+            <w:r>
+              <w:rPr>
+                <w:sz w:val="18"/>
+              </w:rPr>
+              <w:t>Sets recognized voice transcript into prompt field</w:t>
+            </w:r>
+          </w:p>
+        </w:tc>
+        <w:tc>
+          <w:tcPr>
+            <w:tcW w:type="dxa" w:w="1152"/>
+            <w:shd w:fill="F8FAFC"/>
+            <w:tcMar>
+              <w:top w:w="140" w:type="dxa"/>
+              <w:bottom w:w="140" w:type="dxa"/>
+              <w:left w:w="180" w:type="dxa"/>
+              <w:right w:w="180" w:type="dxa"/>
+            </w:tcMar>
+          </w:tcPr>
+          <w:p>
+            <w:pPr>
+              <w:spacing w:after="40"/>
+            </w:pPr>
+            <w:r>
+              <w:rPr>
+                <w:b/>
+                <w:color w:val="27AE60"/>
+                <w:sz w:val="18"/>
+              </w:rPr>
+              <w:t>PASSED (100%)</w:t>
+            </w:r>
+          </w:p>
+        </w:tc>
+      </w:tr>
+      <w:tr>
+        <w:tc>
+          <w:tcPr>
+            <w:tcW w:type="dxa" w:w="3744"/>
+            <w:shd w:fill="FFFFFF"/>
+            <w:tcMar>
+              <w:top w:w="140" w:type="dxa"/>
+              <w:bottom w:w="140" w:type="dxa"/>
+              <w:left w:w="180" w:type="dxa"/>
+              <w:right w:w="180" w:type="dxa"/>
+            </w:tcMar>
+          </w:tcPr>
+          <w:p>
+            <w:pPr>
+              <w:spacing w:after="40"/>
+            </w:pPr>
+            <w:r>
+              <w:rPr>
+                <w:b/>
+                <w:sz w:val="18"/>
+              </w:rPr>
+              <w:t>onSend_successfully_adds_user_and_assistant_messages</w:t>
+            </w:r>
+          </w:p>
+        </w:tc>
+        <w:tc>
+          <w:tcPr>
+            <w:tcW w:type="dxa" w:w="1872"/>
+            <w:shd w:fill="FFFFFF"/>
+            <w:tcMar>
+              <w:top w:w="140" w:type="dxa"/>
+              <w:bottom w:w="140" w:type="dxa"/>
+              <w:left w:w="180" w:type="dxa"/>
+              <w:right w:w="180" w:type="dxa"/>
+            </w:tcMar>
+          </w:tcPr>
+          <w:p>
+            <w:pPr>
+              <w:spacing w:after="40"/>
+            </w:pPr>
+            <w:r>
+              <w:rPr>
+                <w:sz w:val="18"/>
+              </w:rPr>
+              <w:t>ChatViewModel / Gemini Repo</w:t>
+            </w:r>
+          </w:p>
+        </w:tc>
+        <w:tc>
+          <w:tcPr>
+            <w:tcW w:type="dxa" w:w="3024"/>
+            <w:shd w:fill="FFFFFF"/>
+            <w:tcMar>
+              <w:top w:w="140" w:type="dxa"/>
+              <w:bottom w:w="140" w:type="dxa"/>
+              <w:left w:w="180" w:type="dxa"/>
+              <w:right w:w="180" w:type="dxa"/>
+            </w:tcMar>
+          </w:tcPr>
+          <w:p>
+            <w:pPr>
+              <w:spacing w:after="40"/>
+            </w:pPr>
+            <w:r>
+              <w:rPr>
+                <w:sz w:val="18"/>
+              </w:rPr>
+              <w:t>Appends user prompt and AI generated response to history</w:t>
+            </w:r>
+          </w:p>
+        </w:tc>
+        <w:tc>
+          <w:tcPr>
+            <w:tcW w:type="dxa" w:w="1152"/>
+            <w:shd w:fill="FFFFFF"/>
+            <w:tcMar>
+              <w:top w:w="140" w:type="dxa"/>
+              <w:bottom w:w="140" w:type="dxa"/>
+              <w:left w:w="180" w:type="dxa"/>
+              <w:right w:w="180" w:type="dxa"/>
+            </w:tcMar>
+          </w:tcPr>
+          <w:p>
+            <w:pPr>
+              <w:spacing w:after="40"/>
+            </w:pPr>
+            <w:r>
+              <w:rPr>
+                <w:b/>
+                <w:color w:val="27AE60"/>
+                <w:sz w:val="18"/>
+              </w:rPr>
+              <w:t>PASSED (100%)</w:t>
+            </w:r>
+          </w:p>
+        </w:tc>
+      </w:tr>
+      <w:tr>
+        <w:tc>
+          <w:tcPr>
+            <w:tcW w:type="dxa" w:w="3744"/>
+            <w:shd w:fill="F8FAFC"/>
+            <w:tcMar>
+              <w:top w:w="140" w:type="dxa"/>
+              <w:bottom w:w="140" w:type="dxa"/>
+              <w:left w:w="180" w:type="dxa"/>
+              <w:right w:w="180" w:type="dxa"/>
+            </w:tcMar>
+          </w:tcPr>
+          <w:p>
+            <w:pPr>
+              <w:spacing w:after="40"/>
+            </w:pPr>
+            <w:r>
+              <w:rPr>
+                <w:b/>
+                <w:sz w:val="18"/>
+              </w:rPr>
+              <w:t>onSend_handles_failure_and_sets_error_message</w:t>
+            </w:r>
+          </w:p>
+        </w:tc>
+        <w:tc>
+          <w:tcPr>
+            <w:tcW w:type="dxa" w:w="1872"/>
+            <w:shd w:fill="F8FAFC"/>
+            <w:tcMar>
+              <w:top w:w="140" w:type="dxa"/>
+              <w:bottom w:w="140" w:type="dxa"/>
+              <w:left w:w="180" w:type="dxa"/>
+              <w:right w:w="180" w:type="dxa"/>
+            </w:tcMar>
+          </w:tcPr>
+          <w:p>
+            <w:pPr>
+              <w:spacing w:after="40"/>
+            </w:pPr>
+            <w:r>
+              <w:rPr>
+                <w:sz w:val="18"/>
+              </w:rPr>
+              <w:t>ChatViewModel / Error Handling</w:t>
+            </w:r>
+          </w:p>
+        </w:tc>
+        <w:tc>
+          <w:tcPr>
+            <w:tcW w:type="dxa" w:w="3024"/>
+            <w:shd w:fill="F8FAFC"/>
+            <w:tcMar>
+              <w:top w:w="140" w:type="dxa"/>
+              <w:bottom w:w="140" w:type="dxa"/>
+              <w:left w:w="180" w:type="dxa"/>
+              <w:right w:w="180" w:type="dxa"/>
+            </w:tcMar>
+          </w:tcPr>
+          <w:p>
+            <w:pPr>
+              <w:spacing w:after="40"/>
+            </w:pPr>
+            <w:r>
+              <w:rPr>
+                <w:sz w:val="18"/>
+              </w:rPr>
+              <w:t>Captures exception and exposes formatted error message</w:t>
+            </w:r>
+          </w:p>
+        </w:tc>
+        <w:tc>
+          <w:tcPr>
+            <w:tcW w:type="dxa" w:w="1152"/>
+            <w:shd w:fill="F8FAFC"/>
+            <w:tcMar>
+              <w:top w:w="140" w:type="dxa"/>
+              <w:bottom w:w="140" w:type="dxa"/>
+              <w:left w:w="180" w:type="dxa"/>
+              <w:right w:w="180" w:type="dxa"/>
+            </w:tcMar>
+          </w:tcPr>
+          <w:p>
+            <w:pPr>
+              <w:spacing w:after="40"/>
+            </w:pPr>
+            <w:r>
+              <w:rPr>
+                <w:b/>
+                <w:color w:val="27AE60"/>
+                <w:sz w:val="18"/>
+              </w:rPr>
+              <w:t>PASSED (100%)</w:t>
+            </w:r>
+          </w:p>
+        </w:tc>
+      </w:tr>
+      <w:tr>
+        <w:tc>
+          <w:tcPr>
+            <w:tcW w:type="dxa" w:w="3744"/>
+            <w:shd w:fill="FFFFFF"/>
+            <w:tcMar>
+              <w:top w:w="140" w:type="dxa"/>
+              <w:bottom w:w="140" w:type="dxa"/>
+              <w:left w:w="180" w:type="dxa"/>
+              <w:right w:w="180" w:type="dxa"/>
+            </w:tcMar>
+          </w:tcPr>
+          <w:p>
+            <w:pPr>
+              <w:spacing w:after="40"/>
+            </w:pPr>
+            <w:r>
+              <w:rPr>
+                <w:b/>
+                <w:sz w:val="18"/>
+              </w:rPr>
+              <w:t>clearChat_empties_conversation_history</w:t>
+            </w:r>
+          </w:p>
+        </w:tc>
+        <w:tc>
+          <w:tcPr>
+            <w:tcW w:type="dxa" w:w="1872"/>
+            <w:shd w:fill="FFFFFF"/>
+            <w:tcMar>
+              <w:top w:w="140" w:type="dxa"/>
+              <w:bottom w:w="140" w:type="dxa"/>
+              <w:left w:w="180" w:type="dxa"/>
+              <w:right w:w="180" w:type="dxa"/>
+            </w:tcMar>
+          </w:tcPr>
+          <w:p>
+            <w:pPr>
+              <w:spacing w:after="40"/>
+            </w:pPr>
+            <w:r>
+              <w:rPr>
+                <w:sz w:val="18"/>
+              </w:rPr>
+              <w:t>ChatViewModel / Persistence</w:t>
+            </w:r>
+          </w:p>
+        </w:tc>
+        <w:tc>
+          <w:tcPr>
+            <w:tcW w:type="dxa" w:w="3024"/>
+            <w:shd w:fill="FFFFFF"/>
+            <w:tcMar>
+              <w:top w:w="140" w:type="dxa"/>
+              <w:bottom w:w="140" w:type="dxa"/>
+              <w:left w:w="180" w:type="dxa"/>
+              <w:right w:w="180" w:type="dxa"/>
+            </w:tcMar>
+          </w:tcPr>
+          <w:p>
+            <w:pPr>
+              <w:spacing w:after="40"/>
+            </w:pPr>
+            <w:r>
+              <w:rPr>
+                <w:sz w:val="18"/>
+              </w:rPr>
+              <w:t>Clears all message entities from database and emits empty list</w:t>
+            </w:r>
+          </w:p>
+        </w:tc>
+        <w:tc>
+          <w:tcPr>
+            <w:tcW w:type="dxa" w:w="1152"/>
+            <w:shd w:fill="FFFFFF"/>
+            <w:tcMar>
+              <w:top w:w="140" w:type="dxa"/>
+              <w:bottom w:w="140" w:type="dxa"/>
+              <w:left w:w="180" w:type="dxa"/>
+              <w:right w:w="180" w:type="dxa"/>
+            </w:tcMar>
+          </w:tcPr>
+          <w:p>
+            <w:pPr>
+              <w:spacing w:after="40"/>
+            </w:pPr>
+            <w:r>
+              <w:rPr>
+                <w:b/>
+                <w:color w:val="27AE60"/>
+                <w:sz w:val="18"/>
+              </w:rPr>
+              <w:t>PASSED (100%)</w:t>
+            </w:r>
+          </w:p>
+        </w:tc>
+      </w:tr>
+      <w:tr>
+        <w:tc>
+          <w:tcPr>
+            <w:tcW w:type="dxa" w:w="3744"/>
+            <w:shd w:fill="F8FAFC"/>
+            <w:tcMar>
+              <w:top w:w="140" w:type="dxa"/>
+              <w:bottom w:w="140" w:type="dxa"/>
+              <w:left w:w="180" w:type="dxa"/>
+              <w:right w:w="180" w:type="dxa"/>
+            </w:tcMar>
+          </w:tcPr>
+          <w:p>
+            <w:pPr>
+              <w:spacing w:after="40"/>
+            </w:pPr>
+            <w:r>
+              <w:rPr>
+                <w:b/>
+                <w:sz w:val="18"/>
+              </w:rPr>
+              <w:t>saveSettings_updates_instructions_and_temperature</w:t>
+            </w:r>
+          </w:p>
+        </w:tc>
+        <w:tc>
+          <w:tcPr>
+            <w:tcW w:type="dxa" w:w="1872"/>
+            <w:shd w:fill="F8FAFC"/>
+            <w:tcMar>
+              <w:top w:w="140" w:type="dxa"/>
+              <w:bottom w:w="140" w:type="dxa"/>
+              <w:left w:w="180" w:type="dxa"/>
+              <w:right w:w="180" w:type="dxa"/>
+            </w:tcMar>
+          </w:tcPr>
+          <w:p>
+            <w:pPr>
+              <w:spacing w:after="40"/>
+            </w:pPr>
+            <w:r>
+              <w:rPr>
+                <w:sz w:val="18"/>
+              </w:rPr>
+              <w:t>Preferences DataStore</w:t>
+            </w:r>
+          </w:p>
+        </w:tc>
+        <w:tc>
+          <w:tcPr>
+            <w:tcW w:type="dxa" w:w="3024"/>
+            <w:shd w:fill="F8FAFC"/>
+            <w:tcMar>
+              <w:top w:w="140" w:type="dxa"/>
+              <w:bottom w:w="140" w:type="dxa"/>
+              <w:left w:w="180" w:type="dxa"/>
+              <w:right w:w="180" w:type="dxa"/>
+            </w:tcMar>
+          </w:tcPr>
+          <w:p>
+            <w:pPr>
+              <w:spacing w:after="40"/>
+            </w:pPr>
+            <w:r>
+              <w:rPr>
+                <w:sz w:val="18"/>
+              </w:rPr>
+              <w:t>Persists modified system prompt and temperature slider value</w:t>
+            </w:r>
+          </w:p>
+        </w:tc>
+        <w:tc>
+          <w:tcPr>
+            <w:tcW w:type="dxa" w:w="1152"/>
+            <w:shd w:fill="F8FAFC"/>
+            <w:tcMar>
+              <w:top w:w="140" w:type="dxa"/>
+              <w:bottom w:w="140" w:type="dxa"/>
+              <w:left w:w="180" w:type="dxa"/>
+              <w:right w:w="180" w:type="dxa"/>
+            </w:tcMar>
+          </w:tcPr>
+          <w:p>
+            <w:pPr>
+              <w:spacing w:after="40"/>
+            </w:pPr>
+            <w:r>
+              <w:rPr>
+                <w:b/>
+                <w:color w:val="27AE60"/>
+                <w:sz w:val="18"/>
+              </w:rPr>
+              <w:t>PASSED (100%)</w:t>
             </w:r>
           </w:p>
         </w:tc>
@@ -637,735 +2030,60 @@
     </w:tbl>
     <w:p>
       <w:pPr>
-        <w:spacing w:before="0" w:after="120"/>
+        <w:spacing w:after="120"/>
       </w:pPr>
     </w:p>
     <w:p>
       <w:pPr>
         <w:pStyle w:val="Heading1"/>
-        <w:spacing w:before="280" w:after="120"/>
       </w:pPr>
       <w:r>
         <w:rPr>
-          <w:rFonts w:ascii="Calibri" w:hAnsi="Calibri"/>
-          <w:b/>
-          <w:color w:val="1565C0"/>
-          <w:sz w:val="32"/>
+          <w:color w:val="182B49"/>
         </w:rPr>
-        <w:t>3. Security &amp; Hardware Keystore Encryption</w:t>
+        <w:t>6. Production Security Analysis ('Know the Limits')</w:t>
       </w:r>
     </w:p>
     <w:p>
       <w:r>
-        <w:t>To fulfill the mandatory API key security requirements without risking credential leakage:</w:t>
-        <w:br/>
-        <w:t>1. Zero Hardcoding: The API key is stored in local.properties (listed in .gitignore) and never committed.</w:t>
-        <w:br/>
-        <w:t>2. CI Fallback: app/build.gradle.kts reads the key dynamically from local.properties or System.getenv("GEMINI_API_KEY").</w:t>
-        <w:br/>
-        <w:t>3. Hardware Encryption-at-Rest: On first launch, KeystoreHelper generates an AES-256-GCM hardware key inside AndroidKeyStore using KeyGenParameterSpec.</w:t>
-        <w:br/>
-        <w:t>4. In-Memory Decryption: The API key is decrypted into RAM strictly at the moment GenerativeModel is created. It is never logged or toasted.</w:t>
+        <w:t>As required by the NMIMS Lab Manual, client-side encryption significantly raises the bar against casual extraction, but cannot completely conceal an API key from an attacker with full root access and dynamic memory instrumentation.</w:t>
       </w:r>
     </w:p>
-    <w:tbl>
-      <w:tblPr>
-        <w:tblW w:type="auto" w:w="0"/>
-        <w:jc w:val="center"/>
-        <w:tblLook w:firstColumn="1" w:firstRow="1" w:lastColumn="0" w:lastRow="0" w:noHBand="0" w:noVBand="1" w:val="04A0"/>
-      </w:tblPr>
-      <w:tblGrid>
-        <w:gridCol w:w="9936"/>
-      </w:tblGrid>
-      <w:tr>
-        <w:tc>
-          <w:tcPr>
-            <w:tcW w:type="dxa" w:w="9936"/>
-            <w:shd w:fill="F4F6F9"/>
-            <w:tcMar>
-              <w:top w:w="120" w:type="dxa"/>
-              <w:bottom w:w="120" w:type="dxa"/>
-              <w:left w:w="180" w:type="dxa"/>
-              <w:right w:w="180" w:type="dxa"/>
-            </w:tcMar>
-          </w:tcPr>
-          <w:p>
-            <w:pPr>
-              <w:spacing w:before="0" w:after="0"/>
-            </w:pPr>
-            <w:r>
-              <w:rPr>
-                <w:rFonts w:ascii="Consolas" w:hAnsi="Consolas"/>
-                <w:color w:val="212121"/>
-                <w:sz w:val="19"/>
-              </w:rPr>
-              <w:t>// KeystoreHelper: Generating AES-256-GCM Hardware-backed Key</w:t>
-              <w:br/>
-              <w:t>val keyGenParameterSpec = KeyGenParameterSpec.Builder(</w:t>
-              <w:br/>
-              <w:t xml:space="preserve">    KEY_ALIAS,</w:t>
-              <w:br/>
-              <w:t xml:space="preserve">    KeyProperties.PURPOSE_ENCRYPT or KeyProperties.PURPOSE_DECRYPT</w:t>
-              <w:br/>
-              <w:t>)</w:t>
-              <w:br/>
-              <w:t xml:space="preserve">    .setBlockModes(KeyProperties.BLOCK_MODE_GCM)</w:t>
-              <w:br/>
-              <w:t xml:space="preserve">    .setEncryptionPaddings(KeyProperties.ENCRYPTION_PADDING_NONE)</w:t>
-              <w:br/>
-              <w:t xml:space="preserve">    .setKeySize(256)</w:t>
-              <w:br/>
-              <w:t xml:space="preserve">    .setUserAuthenticationRequired(false)</w:t>
-              <w:br/>
-              <w:t xml:space="preserve">    .setRandomizedEncryptionRequired(true)</w:t>
-              <w:br/>
-              <w:t xml:space="preserve">    .build()</w:t>
-            </w:r>
-          </w:p>
-        </w:tc>
-      </w:tr>
-    </w:tbl>
     <w:p>
       <w:pPr>
-        <w:spacing w:before="0" w:after="120"/>
+        <w:pStyle w:val="ListBullet"/>
+      </w:pPr>
+      <w:r>
+        <w:t>1. Dynamic Memory Hooking: An attacker on a rooted Android device can use dynamic binary instrumentation (Frida / Xposed) to hook the GenerativeModel constructor or javax.crypto.Cipher.doFinal() and extract the plaintext key from memory.</w:t>
+      </w:r>
+    </w:p>
+    <w:p>
+      <w:pPr>
+        <w:pStyle w:val="ListBullet"/>
+      </w:pPr>
+      <w:r>
+        <w:t>2. Recommended Enterprise Solution: In commercial production environments, mobile clients should never hold direct LLM API keys. Instead, requests must route through a secure backend proxy (e.g., Ktor, Firebase Cloud Functions, or Cloud Run) authenticated via Firebase App Check / Play Integrity. The backend server securely retrieves the API key from Google Cloud Secret Manager.</w:t>
+      </w:r>
+    </w:p>
+    <w:p>
+      <w:pPr>
+        <w:spacing w:after="160"/>
       </w:pPr>
     </w:p>
     <w:p>
       <w:pPr>
         <w:pStyle w:val="Heading1"/>
-        <w:spacing w:before="280" w:after="120"/>
       </w:pPr>
       <w:r>
         <w:rPr>
-          <w:rFonts w:ascii="Calibri" w:hAnsi="Calibri"/>
-          <w:b/>
-          <w:color w:val="1565C0"/>
-          <w:sz w:val="32"/>
+          <w:color w:val="182B49"/>
         </w:rPr>
-        <w:t>4. User Interface &amp; Jetpack Compose Enhancements</w:t>
+        <w:t>7. Conclusion &amp; Submission Checklist</w:t>
       </w:r>
     </w:p>
     <w:p>
       <w:r>
-        <w:t>The user interface is built with 100% Jetpack Compose and Material 3 design components:</w:t>
-        <w:br/>
-        <w:t>• LazyColumn with Stable Keys: Each message bubble uses key = { message.id } for optimal recomposition skipping.</w:t>
-        <w:br/>
-        <w:t>• Synchronized Auto-Scroll: rememberLazyListState() animates to new messages using LaunchedEffect(state.messages.size).</w:t>
-        <w:br/>
-        <w:t>• Unidirectional Data Flow: ChatUiState is exposed as StateFlow&lt;ChatUiState&gt; and collected via collectAsStateWithLifecycle().</w:t>
-        <w:br/>
-        <w:t>• Adaptive Layouts: Supports phones (single-pane) and tablets/landscape (master-detail two-pane) using WindowSizeClass.</w:t>
-        <w:br/>
-        <w:t>• Suggestion Chips: Quick prompt chips allowing one-tap exploration of Kotlin, Compose, and AI concepts.</w:t>
-      </w:r>
-    </w:p>
-    <w:p>
-      <w:pPr>
-        <w:pStyle w:val="Heading1"/>
-        <w:spacing w:before="280" w:after="120"/>
-      </w:pPr>
-      <w:r>
-        <w:rPr>
-          <w:rFonts w:ascii="Calibri" w:hAnsi="Calibri"/>
-          <w:b/>
-          <w:color w:val="1565C0"/>
-          <w:sz w:val="32"/>
-        </w:rPr>
-        <w:t>5. Local Persistence &amp; Preferences DataStore</w:t>
-      </w:r>
-    </w:p>
-    <w:p>
-      <w:r>
-        <w:t>• Room Database (AppDatabase, ChatMessageDao, ChatMessageEntity): All conversations (user inputs, AI answers, timestamps, and error flags) are saved locally in an SQLite database, ensuring chat history survives process death and device restarts.</w:t>
-        <w:br/>
-        <w:t>• Preferences DataStore (PreferencesManager): Stores custom AI system instructions and creativity temperature settings in an asynchronous, non-blocking data store.</w:t>
-      </w:r>
-    </w:p>
-    <w:p>
-      <w:pPr>
-        <w:pStyle w:val="Heading1"/>
-        <w:spacing w:before="280" w:after="120"/>
-      </w:pPr>
-      <w:r>
-        <w:rPr>
-          <w:rFonts w:ascii="Calibri" w:hAnsi="Calibri"/>
-          <w:b/>
-          <w:color w:val="1565C0"/>
-          <w:sz w:val="32"/>
-        </w:rPr>
-        <w:t>6. Speech-to-Text (Voice Input) Modality</w:t>
-      </w:r>
-    </w:p>
-    <w:p>
-      <w:r>
-        <w:t>Multimodal voice transcription is implemented using Android's native RecognizerIntent.ACTION_RECOGNIZE_SPEECH and invoked via rememberLauncherForActivityResult(ActivityResultContracts.StartActivityForResult()). Transcribed text is passed directly to the ViewModel for query execution.</w:t>
-      </w:r>
-    </w:p>
-    <w:p>
-      <w:pPr>
-        <w:pStyle w:val="Heading1"/>
-        <w:spacing w:before="280" w:after="120"/>
-      </w:pPr>
-      <w:r>
-        <w:rPr>
-          <w:rFonts w:ascii="Calibri" w:hAnsi="Calibri"/>
-          <w:b/>
-          <w:color w:val="1565C0"/>
-          <w:sz w:val="32"/>
-        </w:rPr>
-        <w:t>7. Automated Testing Suite</w:t>
-      </w:r>
-    </w:p>
-    <w:p>
-      <w:r>
-        <w:t>The project includes full unit test and Compose UI test coverage:</w:t>
-        <w:br/>
-        <w:t>• Unit Tests (ChatViewModelTest.kt): Validates initial states, prompt mutations, voice query dispatching, success responses, API failure states, and history clearing using kotlinx-coroutines-test.</w:t>
-        <w:br/>
-        <w:t>• Compose UI Tests (ChatScreenTest.kt): Verifies welcome card rendering, message bubble display, typing simulation, and voice trigger buttons using createComposeRule().</w:t>
-      </w:r>
-    </w:p>
-    <w:tbl>
-      <w:tblPr>
-        <w:tblW w:type="auto" w:w="0"/>
-        <w:jc w:val="center"/>
-        <w:tblLook w:firstColumn="1" w:firstRow="1" w:lastColumn="0" w:lastRow="0" w:noHBand="0" w:noVBand="1" w:val="04A0"/>
-      </w:tblPr>
-      <w:tblGrid>
-        <w:gridCol w:w="9936"/>
-      </w:tblGrid>
-      <w:tr>
-        <w:tc>
-          <w:tcPr>
-            <w:tcW w:type="dxa" w:w="9936"/>
-            <w:shd w:fill="F4F6F9"/>
-            <w:tcMar>
-              <w:top w:w="120" w:type="dxa"/>
-              <w:bottom w:w="120" w:type="dxa"/>
-              <w:left w:w="180" w:type="dxa"/>
-              <w:right w:w="180" w:type="dxa"/>
-            </w:tcMar>
-          </w:tcPr>
-          <w:p>
-            <w:pPr>
-              <w:spacing w:before="0" w:after="0"/>
-            </w:pPr>
-            <w:r>
-              <w:rPr>
-                <w:rFonts w:ascii="Consolas" w:hAnsi="Consolas"/>
-                <w:color w:val="212121"/>
-                <w:sz w:val="19"/>
-              </w:rPr>
-              <w:t># Commands to run test suite:</w:t>
-              <w:br/>
-              <w:t>./gradlew testDebugUnitTest       # Runs Unit Tests</w:t>
-              <w:br/>
-              <w:t>./gradlew connectedAndroidTest    # Runs Instrumented Compose UI Tests</w:t>
-            </w:r>
-          </w:p>
-        </w:tc>
-      </w:tr>
-    </w:tbl>
-    <w:p>
-      <w:pPr>
-        <w:spacing w:before="0" w:after="120"/>
-      </w:pPr>
-    </w:p>
-    <w:p>
-      <w:pPr>
-        <w:pStyle w:val="Heading1"/>
-        <w:spacing w:before="280" w:after="120"/>
-      </w:pPr>
-      <w:r>
-        <w:rPr>
-          <w:rFonts w:ascii="Calibri" w:hAnsi="Calibri"/>
-          <w:b/>
-          <w:color w:val="1565C0"/>
-          <w:sz w:val="32"/>
-        </w:rPr>
-        <w:t>8. Production Security Analysis ('Know the Limits')</w:t>
-      </w:r>
-    </w:p>
-    <w:p>
-      <w:r>
-        <w:t>As highlighted in Section 3 of the lab manual, client-side encryption elevates security but cannot fully conceal secrets from a determined attacker with root access using dynamic memory hooking frameworks (e.g., Frida, Xposed).</w:t>
-        <w:br/>
-        <w:br/>
-        <w:t>Production Recommendations:</w:t>
-        <w:br/>
-        <w:t>1. Backend Proxy Architecture: Relocate Gemini API calls to a secure backend server (Firebase Cloud Functions / Ktor) that holds the API key in Google Cloud Secret Manager.</w:t>
-        <w:br/>
-        <w:t>2. Firebase App Check &amp; Play Integrity API: Ensure only genuine, untampered instances of the mobile application on authentic Android devices can communicate with the backend.</w:t>
-        <w:br/>
-        <w:t>3. Google Cloud Restrictions: Restrict API keys by Android Package Name (com.devraj.geminiassistant) and SHA-256 certificate fingerprint.</w:t>
-      </w:r>
-    </w:p>
-    <w:p>
-      <w:pPr>
-        <w:pStyle w:val="Heading1"/>
-        <w:spacing w:before="280" w:after="120"/>
-      </w:pPr>
-      <w:r>
-        <w:rPr>
-          <w:rFonts w:ascii="Calibri" w:hAnsi="Calibri"/>
-          <w:b/>
-          <w:color w:val="1565C0"/>
-          <w:sz w:val="32"/>
-        </w:rPr>
-        <w:t>9. Submission Checklist &amp; Git Verification</w:t>
-      </w:r>
-    </w:p>
-    <w:tbl>
-      <w:tblPr>
-        <w:tblW w:type="auto" w:w="0"/>
-        <w:jc w:val="center"/>
-        <w:tblLook w:firstColumn="1" w:firstRow="1" w:lastColumn="0" w:lastRow="0" w:noHBand="0" w:noVBand="1" w:val="04A0"/>
-      </w:tblPr>
-      <w:tblGrid>
-        <w:gridCol w:w="4968"/>
-        <w:gridCol w:w="4968"/>
-      </w:tblGrid>
-      <w:tr>
-        <w:tc>
-          <w:tcPr>
-            <w:tcW w:type="dxa" w:w="3168"/>
-            <w:shd w:fill="F0F4F8"/>
-            <w:tcMar>
-              <w:top w:w="60" w:type="dxa"/>
-              <w:bottom w:w="60" w:type="dxa"/>
-              <w:left w:w="100" w:type="dxa"/>
-              <w:right w:w="100" w:type="dxa"/>
-            </w:tcMar>
-          </w:tcPr>
-          <w:p>
-            <w:pPr>
-              <w:spacing w:before="0" w:after="0"/>
-            </w:pPr>
-            <w:r>
-              <w:rPr>
-                <w:rFonts w:ascii="Calibri" w:hAnsi="Calibri"/>
-                <w:b/>
-                <w:sz w:val="19"/>
-              </w:rPr>
-              <w:t>Student Identifier</w:t>
-            </w:r>
-          </w:p>
-        </w:tc>
-        <w:tc>
-          <w:tcPr>
-            <w:tcW w:type="dxa" w:w="6480"/>
-            <w:shd w:fill="FFFFFF"/>
-            <w:tcMar>
-              <w:top w:w="60" w:type="dxa"/>
-              <w:bottom w:w="60" w:type="dxa"/>
-              <w:left w:w="100" w:type="dxa"/>
-              <w:right w:w="100" w:type="dxa"/>
-            </w:tcMar>
-          </w:tcPr>
-          <w:p>
-            <w:pPr>
-              <w:spacing w:before="0" w:after="0"/>
-            </w:pPr>
-            <w:r>
-              <w:rPr>
-                <w:rFonts w:ascii="Calibri" w:hAnsi="Calibri"/>
-                <w:color w:val="2E7D32"/>
-                <w:sz w:val="19"/>
-              </w:rPr>
-              <w:t>✔  Devraj Murari — Roll Number: N066</w:t>
-            </w:r>
-          </w:p>
-        </w:tc>
-      </w:tr>
-      <w:tr>
-        <w:tc>
-          <w:tcPr>
-            <w:tcW w:type="dxa" w:w="3168"/>
-            <w:shd w:fill="F0F4F8"/>
-            <w:tcMar>
-              <w:top w:w="60" w:type="dxa"/>
-              <w:bottom w:w="60" w:type="dxa"/>
-              <w:left w:w="100" w:type="dxa"/>
-              <w:right w:w="100" w:type="dxa"/>
-            </w:tcMar>
-          </w:tcPr>
-          <w:p>
-            <w:pPr>
-              <w:spacing w:before="0" w:after="0"/>
-            </w:pPr>
-            <w:r>
-              <w:rPr>
-                <w:rFonts w:ascii="Calibri" w:hAnsi="Calibri"/>
-                <w:b/>
-                <w:sz w:val="19"/>
-              </w:rPr>
-              <w:t>Git Branch Format</w:t>
-            </w:r>
-          </w:p>
-        </w:tc>
-        <w:tc>
-          <w:tcPr>
-            <w:tcW w:type="dxa" w:w="6480"/>
-            <w:shd w:fill="FFFFFF"/>
-            <w:tcMar>
-              <w:top w:w="60" w:type="dxa"/>
-              <w:bottom w:w="60" w:type="dxa"/>
-              <w:left w:w="100" w:type="dxa"/>
-              <w:right w:w="100" w:type="dxa"/>
-            </w:tcMar>
-          </w:tcPr>
-          <w:p>
-            <w:pPr>
-              <w:spacing w:before="0" w:after="0"/>
-            </w:pPr>
-            <w:r>
-              <w:rPr>
-                <w:rFonts w:ascii="Calibri" w:hAnsi="Calibri"/>
-                <w:color w:val="2E7D32"/>
-                <w:sz w:val="19"/>
-              </w:rPr>
-              <w:t>✔  N066_assignment_1 (starts with roll number N066)</w:t>
-            </w:r>
-          </w:p>
-        </w:tc>
-      </w:tr>
-      <w:tr>
-        <w:tc>
-          <w:tcPr>
-            <w:tcW w:type="dxa" w:w="3168"/>
-            <w:shd w:fill="F0F4F8"/>
-            <w:tcMar>
-              <w:top w:w="60" w:type="dxa"/>
-              <w:bottom w:w="60" w:type="dxa"/>
-              <w:left w:w="100" w:type="dxa"/>
-              <w:right w:w="100" w:type="dxa"/>
-            </w:tcMar>
-          </w:tcPr>
-          <w:p>
-            <w:pPr>
-              <w:spacing w:before="0" w:after="0"/>
-            </w:pPr>
-            <w:r>
-              <w:rPr>
-                <w:rFonts w:ascii="Calibri" w:hAnsi="Calibri"/>
-                <w:b/>
-                <w:sz w:val="19"/>
-              </w:rPr>
-              <w:t>Package Refactoring</w:t>
-            </w:r>
-          </w:p>
-        </w:tc>
-        <w:tc>
-          <w:tcPr>
-            <w:tcW w:type="dxa" w:w="6480"/>
-            <w:shd w:fill="FFFFFF"/>
-            <w:tcMar>
-              <w:top w:w="60" w:type="dxa"/>
-              <w:bottom w:w="60" w:type="dxa"/>
-              <w:left w:w="100" w:type="dxa"/>
-              <w:right w:w="100" w:type="dxa"/>
-            </w:tcMar>
-          </w:tcPr>
-          <w:p>
-            <w:pPr>
-              <w:spacing w:before="0" w:after="0"/>
-            </w:pPr>
-            <w:r>
-              <w:rPr>
-                <w:rFonts w:ascii="Calibri" w:hAnsi="Calibri"/>
-                <w:color w:val="2E7D32"/>
-                <w:sz w:val="19"/>
-              </w:rPr>
-              <w:t>✔  com.devraj.geminiassistant (Clean custom package)</w:t>
-            </w:r>
-          </w:p>
-        </w:tc>
-      </w:tr>
-      <w:tr>
-        <w:tc>
-          <w:tcPr>
-            <w:tcW w:type="dxa" w:w="3168"/>
-            <w:shd w:fill="F0F4F8"/>
-            <w:tcMar>
-              <w:top w:w="60" w:type="dxa"/>
-              <w:bottom w:w="60" w:type="dxa"/>
-              <w:left w:w="100" w:type="dxa"/>
-              <w:right w:w="100" w:type="dxa"/>
-            </w:tcMar>
-          </w:tcPr>
-          <w:p>
-            <w:pPr>
-              <w:spacing w:before="0" w:after="0"/>
-            </w:pPr>
-            <w:r>
-              <w:rPr>
-                <w:rFonts w:ascii="Calibri" w:hAnsi="Calibri"/>
-                <w:b/>
-                <w:sz w:val="19"/>
-              </w:rPr>
-              <w:t>Secret Prevention</w:t>
-            </w:r>
-          </w:p>
-        </w:tc>
-        <w:tc>
-          <w:tcPr>
-            <w:tcW w:type="dxa" w:w="6480"/>
-            <w:shd w:fill="FFFFFF"/>
-            <w:tcMar>
-              <w:top w:w="60" w:type="dxa"/>
-              <w:bottom w:w="60" w:type="dxa"/>
-              <w:left w:w="100" w:type="dxa"/>
-              <w:right w:w="100" w:type="dxa"/>
-            </w:tcMar>
-          </w:tcPr>
-          <w:p>
-            <w:pPr>
-              <w:spacing w:before="0" w:after="0"/>
-            </w:pPr>
-            <w:r>
-              <w:rPr>
-                <w:rFonts w:ascii="Calibri" w:hAnsi="Calibri"/>
-                <w:color w:val="2E7D32"/>
-                <w:sz w:val="19"/>
-              </w:rPr>
-              <w:t>✔  local.properties in .gitignore; local.properties.example provided</w:t>
-            </w:r>
-          </w:p>
-        </w:tc>
-      </w:tr>
-      <w:tr>
-        <w:tc>
-          <w:tcPr>
-            <w:tcW w:type="dxa" w:w="3168"/>
-            <w:shd w:fill="F0F4F8"/>
-            <w:tcMar>
-              <w:top w:w="60" w:type="dxa"/>
-              <w:bottom w:w="60" w:type="dxa"/>
-              <w:left w:w="100" w:type="dxa"/>
-              <w:right w:w="100" w:type="dxa"/>
-            </w:tcMar>
-          </w:tcPr>
-          <w:p>
-            <w:pPr>
-              <w:spacing w:before="0" w:after="0"/>
-            </w:pPr>
-            <w:r>
-              <w:rPr>
-                <w:rFonts w:ascii="Calibri" w:hAnsi="Calibri"/>
-                <w:b/>
-                <w:sz w:val="19"/>
-              </w:rPr>
-              <w:t>Keystore AES-256-GCM</w:t>
-            </w:r>
-          </w:p>
-        </w:tc>
-        <w:tc>
-          <w:tcPr>
-            <w:tcW w:type="dxa" w:w="6480"/>
-            <w:shd w:fill="FFFFFF"/>
-            <w:tcMar>
-              <w:top w:w="60" w:type="dxa"/>
-              <w:bottom w:w="60" w:type="dxa"/>
-              <w:left w:w="100" w:type="dxa"/>
-              <w:right w:w="100" w:type="dxa"/>
-            </w:tcMar>
-          </w:tcPr>
-          <w:p>
-            <w:pPr>
-              <w:spacing w:before="0" w:after="0"/>
-            </w:pPr>
-            <w:r>
-              <w:rPr>
-                <w:rFonts w:ascii="Calibri" w:hAnsi="Calibri"/>
-                <w:color w:val="2E7D32"/>
-                <w:sz w:val="19"/>
-              </w:rPr>
-              <w:t>✔  Implemented with on-demand in-memory decryption</w:t>
-            </w:r>
-          </w:p>
-        </w:tc>
-      </w:tr>
-      <w:tr>
-        <w:tc>
-          <w:tcPr>
-            <w:tcW w:type="dxa" w:w="3168"/>
-            <w:shd w:fill="F0F4F8"/>
-            <w:tcMar>
-              <w:top w:w="60" w:type="dxa"/>
-              <w:bottom w:w="60" w:type="dxa"/>
-              <w:left w:w="100" w:type="dxa"/>
-              <w:right w:w="100" w:type="dxa"/>
-            </w:tcMar>
-          </w:tcPr>
-          <w:p>
-            <w:pPr>
-              <w:spacing w:before="0" w:after="0"/>
-            </w:pPr>
-            <w:r>
-              <w:rPr>
-                <w:rFonts w:ascii="Calibri" w:hAnsi="Calibri"/>
-                <w:b/>
-                <w:sz w:val="19"/>
-              </w:rPr>
-              <w:t>Room Persistence</w:t>
-            </w:r>
-          </w:p>
-        </w:tc>
-        <w:tc>
-          <w:tcPr>
-            <w:tcW w:type="dxa" w:w="6480"/>
-            <w:shd w:fill="FFFFFF"/>
-            <w:tcMar>
-              <w:top w:w="60" w:type="dxa"/>
-              <w:bottom w:w="60" w:type="dxa"/>
-              <w:left w:w="100" w:type="dxa"/>
-              <w:right w:w="100" w:type="dxa"/>
-            </w:tcMar>
-          </w:tcPr>
-          <w:p>
-            <w:pPr>
-              <w:spacing w:before="0" w:after="0"/>
-            </w:pPr>
-            <w:r>
-              <w:rPr>
-                <w:rFonts w:ascii="Calibri" w:hAnsi="Calibri"/>
-                <w:color w:val="2E7D32"/>
-                <w:sz w:val="19"/>
-              </w:rPr>
-              <w:t>✔  AppDatabase &amp; ChatMessageDao storing complete history</w:t>
-            </w:r>
-          </w:p>
-        </w:tc>
-      </w:tr>
-      <w:tr>
-        <w:tc>
-          <w:tcPr>
-            <w:tcW w:type="dxa" w:w="3168"/>
-            <w:shd w:fill="F0F4F8"/>
-            <w:tcMar>
-              <w:top w:w="60" w:type="dxa"/>
-              <w:bottom w:w="60" w:type="dxa"/>
-              <w:left w:w="100" w:type="dxa"/>
-              <w:right w:w="100" w:type="dxa"/>
-            </w:tcMar>
-          </w:tcPr>
-          <w:p>
-            <w:pPr>
-              <w:spacing w:before="0" w:after="0"/>
-            </w:pPr>
-            <w:r>
-              <w:rPr>
-                <w:rFonts w:ascii="Calibri" w:hAnsi="Calibri"/>
-                <w:b/>
-                <w:sz w:val="19"/>
-              </w:rPr>
-              <w:t>Jetpack Compose UI</w:t>
-            </w:r>
-          </w:p>
-        </w:tc>
-        <w:tc>
-          <w:tcPr>
-            <w:tcW w:type="dxa" w:w="6480"/>
-            <w:shd w:fill="FFFFFF"/>
-            <w:tcMar>
-              <w:top w:w="60" w:type="dxa"/>
-              <w:bottom w:w="60" w:type="dxa"/>
-              <w:left w:w="100" w:type="dxa"/>
-              <w:right w:w="100" w:type="dxa"/>
-            </w:tcMar>
-          </w:tcPr>
-          <w:p>
-            <w:pPr>
-              <w:spacing w:before="0" w:after="0"/>
-            </w:pPr>
-            <w:r>
-              <w:rPr>
-                <w:rFonts w:ascii="Calibri" w:hAnsi="Calibri"/>
-                <w:color w:val="2E7D32"/>
-                <w:sz w:val="19"/>
-              </w:rPr>
-              <w:t>✔  LazyColumn, auto-scroll, suggestion chips, WindowSizeClass</w:t>
-            </w:r>
-          </w:p>
-        </w:tc>
-      </w:tr>
-      <w:tr>
-        <w:tc>
-          <w:tcPr>
-            <w:tcW w:type="dxa" w:w="3168"/>
-            <w:shd w:fill="F0F4F8"/>
-            <w:tcMar>
-              <w:top w:w="60" w:type="dxa"/>
-              <w:bottom w:w="60" w:type="dxa"/>
-              <w:left w:w="100" w:type="dxa"/>
-              <w:right w:w="100" w:type="dxa"/>
-            </w:tcMar>
-          </w:tcPr>
-          <w:p>
-            <w:pPr>
-              <w:spacing w:before="0" w:after="0"/>
-            </w:pPr>
-            <w:r>
-              <w:rPr>
-                <w:rFonts w:ascii="Calibri" w:hAnsi="Calibri"/>
-                <w:b/>
-                <w:sz w:val="19"/>
-              </w:rPr>
-              <w:t>Test Suite</w:t>
-            </w:r>
-          </w:p>
-        </w:tc>
-        <w:tc>
-          <w:tcPr>
-            <w:tcW w:type="dxa" w:w="6480"/>
-            <w:shd w:fill="FFFFFF"/>
-            <w:tcMar>
-              <w:top w:w="60" w:type="dxa"/>
-              <w:bottom w:w="60" w:type="dxa"/>
-              <w:left w:w="100" w:type="dxa"/>
-              <w:right w:w="100" w:type="dxa"/>
-            </w:tcMar>
-          </w:tcPr>
-          <w:p>
-            <w:pPr>
-              <w:spacing w:before="0" w:after="0"/>
-            </w:pPr>
-            <w:r>
-              <w:rPr>
-                <w:rFonts w:ascii="Calibri" w:hAnsi="Calibri"/>
-                <w:color w:val="2E7D32"/>
-                <w:sz w:val="19"/>
-              </w:rPr>
-              <w:t>✔  Unit tests and UI tests passing successfully</w:t>
-            </w:r>
-          </w:p>
-        </w:tc>
-      </w:tr>
-    </w:tbl>
-    <w:p>
-      <w:pPr>
-        <w:spacing w:after="240"/>
-      </w:pPr>
-    </w:p>
-    <w:p>
-      <w:pPr>
-        <w:pStyle w:val="Heading1"/>
-        <w:spacing w:before="280" w:after="120"/>
-      </w:pPr>
-      <w:r>
-        <w:rPr>
-          <w:rFonts w:ascii="Calibri" w:hAnsi="Calibri"/>
-          <w:b/>
-          <w:color w:val="1565C0"/>
-          <w:sz w:val="32"/>
-        </w:rPr>
-        <w:t>10. Conclusion</w:t>
-      </w:r>
-    </w:p>
-    <w:p>
-      <w:r>
-        <w:t>This project successfully completes all objectives of Mobile Application Development Lab Assignment-1. The resulting application combines hardware-grade security, offline reliability, multi-window adaptability, and AI-powered multimodal interaction, fulfilling all requirements set by SVKM's NMIMS STME.</w:t>
+        <w:t>All requirements set forth in the Mobile Application Development (702AI0E002) Lab Manual have been fully implemented, verified on the Android Studio emulator, tested via unit test suites, and pushed to GitHub under student Devraj Murari (N066).</w:t>
       </w:r>
     </w:p>
     <w:sectPr>
@@ -1741,6 +2459,11 @@
     <w:name w:val="Normal"/>
     <w:qFormat/>
     <w:rsid w:val="00FC693F"/>
+    <w:rPr>
+      <w:rFonts w:ascii="Calibri" w:hAnsi="Calibri"/>
+      <w:color w:val="212529"/>
+      <w:sz w:val="22"/>
+    </w:rPr>
   </w:style>
   <w:style w:type="paragraph" w:styleId="Header">
     <w:name w:val="header"/>

</xml_diff>